<commit_message>
Docs: illustrated 14-slide deck (icons, diagrams, native charts) and handout with per-slide markers
Co-Authored-By: Claude Fable 5.1 <noreply@anthropic.com>
</commit_message>
<xml_diff>
--- a/docs/lecture/因子挖掘-15分钟讲义.docx
+++ b/docs/lecture/因子挖掘-15分钟讲义.docx
@@ -45,7 +45,7 @@
           <w:sz w:val="19"/>
           <w:szCs w:val="19"/>
         </w:rPr>
-        <w:t xml:space="preserve">面向没有量化背景的听众。全文不用公式，每一节都有一个具体例子和一句可以直接讲出来的话。结构分九节，第 4 节是重点：Loop Engineering 怎样用在因子挖掘上。</w:t>
+        <w:t xml:space="preserve">面向没有量化背景的听众。全文不用公式，每一节都有一个具体例子和一句可以直接讲出来的话。结构分九节，第 4 节是重点：Loop Engineering 怎样用在因子挖掘上。每一节开头的深色标签「▶ 幻灯片 N / 14」标出此时屏幕上应停在哪一页，以及那一页上有什么可以指着讲。</w:t>
       </w:r>
     </w:p>
     <w:p>
@@ -68,6 +68,23 @@
           <w:szCs w:val="30"/>
         </w:rPr>
         <w:t xml:space="preserve">开讲之前：这堂课要回答的三个问题</w:t>
+      </w:r>
+    </w:p>
+    <w:p>
+      <w:pPr>
+        <w:spacing w:after="120" w:before="60"/>
+      </w:pPr>
+      <w:r>
+        <w:rPr>
+          <w:rFonts w:ascii="Microsoft YaHei" w:cs="Microsoft YaHei" w:eastAsia="Microsoft YaHei" w:hAnsi="Microsoft YaHei"/>
+          <w:b/>
+          <w:bCs/>
+          <w:color w:val="FFFFFF"/>
+          <w:sz w:val="19"/>
+          <w:szCs w:val="19"/>
+          <w:shd w:fill="13213A" w:color="auto" w:val="clear"/>
+        </w:rPr>
+        <w:t xml:space="preserve">  ▶ 幻灯片 2 / 14　这堂课要回答的三个问题（封面为幻灯片 1）  </w:t>
       </w:r>
     </w:p>
     <w:p>
@@ -192,6 +209,23 @@
     </w:p>
     <w:p>
       <w:pPr>
+        <w:spacing w:after="120" w:before="60"/>
+      </w:pPr>
+      <w:r>
+        <w:rPr>
+          <w:rFonts w:ascii="Microsoft YaHei" w:cs="Microsoft YaHei" w:eastAsia="Microsoft YaHei" w:hAnsi="Microsoft YaHei"/>
+          <w:b/>
+          <w:bCs/>
+          <w:color w:val="FFFFFF"/>
+          <w:sz w:val="19"/>
+          <w:szCs w:val="19"/>
+          <w:shd w:fill="13213A" w:color="auto" w:val="clear"/>
+        </w:rPr>
+        <w:t xml:space="preserve">  ▶ 幻灯片 3 / 14　什么是因子：给全班每天打一个分 —— 左侧排名表配合讲  </w:t>
+      </w:r>
+    </w:p>
+    <w:p>
+      <w:pPr>
         <w:spacing w:after="140" w:line="340"/>
       </w:pPr>
       <w:r>
@@ -292,6 +326,23 @@
     </w:p>
     <w:p>
       <w:pPr>
+        <w:spacing w:after="120" w:before="60"/>
+      </w:pPr>
+      <w:r>
+        <w:rPr>
+          <w:rFonts w:ascii="Microsoft YaHei" w:cs="Microsoft YaHei" w:eastAsia="Microsoft YaHei" w:hAnsi="Microsoft YaHei"/>
+          <w:b/>
+          <w:bCs/>
+          <w:color w:val="FFFFFF"/>
+          <w:sz w:val="19"/>
+          <w:szCs w:val="19"/>
+          <w:shd w:fill="13213A" w:color="auto" w:val="clear"/>
+        </w:rPr>
+        <w:t xml:space="preserve">  ▶ 幻灯片 4 / 14　IC 每日曲线（示意）+ 平均值 / 抖动两张卡  </w:t>
+      </w:r>
+    </w:p>
+    <w:p>
+      <w:pPr>
         <w:spacing w:after="140" w:line="340"/>
       </w:pPr>
       <w:r>
@@ -391,6 +442,23 @@
           <w:szCs w:val="30"/>
         </w:rPr>
         <w:t xml:space="preserve">2　因子长什么样：一套固定的积木</w:t>
+      </w:r>
+    </w:p>
+    <w:p>
+      <w:pPr>
+        <w:spacing w:after="120" w:before="60"/>
+      </w:pPr>
+      <w:r>
+        <w:rPr>
+          <w:rFonts w:ascii="Microsoft YaHei" w:cs="Microsoft YaHei" w:eastAsia="Microsoft YaHei" w:hAnsi="Microsoft YaHei"/>
+          <w:b/>
+          <w:bCs/>
+          <w:color w:val="FFFFFF"/>
+          <w:sz w:val="19"/>
+          <w:szCs w:val="19"/>
+          <w:shd w:fill="13213A" w:color="auto" w:val="clear"/>
+        </w:rPr>
+        <w:t xml:space="preserve">  ▶ 幻灯片 5 / 14　四类积木 + 量价相关性例子  </w:t>
       </w:r>
     </w:p>
     <w:p>
@@ -904,6 +972,23 @@
           <w:szCs w:val="30"/>
         </w:rPr>
         <w:t xml:space="preserve">3　怎么判卷：样本内、留出集和录取线</w:t>
+      </w:r>
+    </w:p>
+    <w:p>
+      <w:pPr>
+        <w:spacing w:after="120" w:before="60"/>
+      </w:pPr>
+      <w:r>
+        <w:rPr>
+          <w:rFonts w:ascii="Microsoft YaHei" w:cs="Microsoft YaHei" w:eastAsia="Microsoft YaHei" w:hAnsi="Microsoft YaHei"/>
+          <w:b/>
+          <w:bCs/>
+          <w:color w:val="FFFFFF"/>
+          <w:sz w:val="19"/>
+          <w:szCs w:val="19"/>
+          <w:shd w:fill="13213A" w:color="auto" w:val="clear"/>
+        </w:rPr>
+        <w:t xml:space="preserve">  ▶ 幻灯片 6 / 14　80/20 时间条 + 样本内 vs 留出柱状图 + 三档录取线  </w:t>
       </w:r>
     </w:p>
     <w:p>
@@ -1556,6 +1641,23 @@
     </w:p>
     <w:p>
       <w:pPr>
+        <w:spacing w:after="120" w:before="60"/>
+      </w:pPr>
+      <w:r>
+        <w:rPr>
+          <w:rFonts w:ascii="Microsoft YaHei" w:cs="Microsoft YaHei" w:eastAsia="Microsoft YaHei" w:hAnsi="Microsoft YaHei"/>
+          <w:b/>
+          <w:bCs/>
+          <w:color w:val="FFFFFF"/>
+          <w:sz w:val="19"/>
+          <w:szCs w:val="19"/>
+          <w:shd w:fill="13213A" w:color="auto" w:val="clear"/>
+        </w:rPr>
+        <w:t xml:space="preserve">  ▶ 幻灯片 7 / 14　四步循环图（生成→评估→反思→更新）—— 4.1 至 4.3 共用此页  </w:t>
+      </w:r>
+    </w:p>
+    <w:p>
+      <w:pPr>
         <w:spacing w:after="140" w:line="340"/>
       </w:pPr>
       <w:r>
@@ -2254,6 +2356,23 @@
     </w:p>
     <w:p>
       <w:pPr>
+        <w:spacing w:after="120" w:before="60"/>
+      </w:pPr>
+      <w:r>
+        <w:rPr>
+          <w:rFonts w:ascii="Microsoft YaHei" w:cs="Microsoft YaHei" w:eastAsia="Microsoft YaHei" w:hAnsi="Microsoft YaHei"/>
+          <w:b/>
+          <w:bCs/>
+          <w:color w:val="FFFFFF"/>
+          <w:sz w:val="19"/>
+          <w:szCs w:val="19"/>
+          <w:shd w:fill="13213A" w:color="auto" w:val="clear"/>
+        </w:rPr>
+        <w:t xml:space="preserve">  ▶ 幻灯片 8 / 14　三轮示例表 —— 逐行念候选、结果、错题本  </w:t>
+      </w:r>
+    </w:p>
+    <w:p>
+      <w:pPr>
         <w:spacing w:after="140" w:line="340"/>
       </w:pPr>
       <w:r>
@@ -3044,6 +3163,23 @@
         <w:t xml:space="preserve">4.5　什么能进下一轮，什么绝对不能</w:t>
       </w:r>
     </w:p>
+    <w:p>
+      <w:pPr>
+        <w:spacing w:after="120" w:before="60"/>
+      </w:pPr>
+      <w:r>
+        <w:rPr>
+          <w:rFonts w:ascii="Microsoft YaHei" w:cs="Microsoft YaHei" w:eastAsia="Microsoft YaHei" w:hAnsi="Microsoft YaHei"/>
+          <w:b/>
+          <w:bCs/>
+          <w:color w:val="FFFFFF"/>
+          <w:sz w:val="19"/>
+          <w:szCs w:val="19"/>
+          <w:shd w:fill="13213A" w:color="auto" w:val="clear"/>
+        </w:rPr>
+        <w:t xml:space="preserve">  ▶ 幻灯片 9 / 14　能进 / 绝对不能进 + 失效模式表 —— 4.5 至 4.7 共用此页  </w:t>
+      </w:r>
+    </w:p>
     <w:tbl>
       <w:tblPr>
         <w:tblW w:type="dxa" w:w="9440"/>
@@ -4200,6 +4336,23 @@
     </w:p>
     <w:p>
       <w:pPr>
+        <w:spacing w:after="120" w:before="60"/>
+      </w:pPr>
+      <w:r>
+        <w:rPr>
+          <w:rFonts w:ascii="Microsoft YaHei" w:cs="Microsoft YaHei" w:eastAsia="Microsoft YaHei" w:hAnsi="Microsoft YaHei"/>
+          <w:b/>
+          <w:bCs/>
+          <w:color w:val="FFFFFF"/>
+          <w:sz w:val="19"/>
+          <w:szCs w:val="19"/>
+          <w:shd w:fill="13213A" w:color="auto" w:val="clear"/>
+        </w:rPr>
+        <w:t xml:space="preserve">  ▶ 幻灯片 10 / 14　语法树图 + 适应度三条修正 + 两种范式对比表  </w:t>
+      </w:r>
+    </w:p>
+    <w:p>
+      <w:pPr>
         <w:spacing w:after="140" w:line="340"/>
       </w:pPr>
       <w:r>
@@ -4825,6 +4978,23 @@
     </w:p>
     <w:p>
       <w:pPr>
+        <w:spacing w:after="120" w:before="60"/>
+      </w:pPr>
+      <w:r>
+        <w:rPr>
+          <w:rFonts w:ascii="Microsoft YaHei" w:cs="Microsoft YaHei" w:eastAsia="Microsoft YaHei" w:hAnsi="Microsoft YaHei"/>
+          <w:b/>
+          <w:bCs/>
+          <w:color w:val="FFFFFF"/>
+          <w:sz w:val="19"/>
+          <w:szCs w:val="19"/>
+          <w:shd w:fill="13213A" w:color="auto" w:val="clear"/>
+        </w:rPr>
+        <w:t xml:space="preserve">  ▶ 幻灯片 11 / 14　组合 vs 基准净值曲线（示意）+ 四个指标  </w:t>
+      </w:r>
+    </w:p>
+    <w:p>
+      <w:pPr>
         <w:spacing w:after="140" w:line="340"/>
       </w:pPr>
       <w:r>
@@ -5338,6 +5508,23 @@
     </w:p>
     <w:p>
       <w:pPr>
+        <w:spacing w:after="120" w:before="60"/>
+      </w:pPr>
+      <w:r>
+        <w:rPr>
+          <w:rFonts w:ascii="Microsoft YaHei" w:cs="Microsoft YaHei" w:eastAsia="Microsoft YaHei" w:hAnsi="Microsoft YaHei"/>
+          <w:b/>
+          <w:bCs/>
+          <w:color w:val="FFFFFF"/>
+          <w:sz w:val="19"/>
+          <w:szCs w:val="19"/>
+          <w:shd w:fill="13213A" w:color="auto" w:val="clear"/>
+        </w:rPr>
+        <w:t xml:space="preserve">  ▶ 幻灯片 12 / 14　IC 随持有期曲线 + 衰减 / 移植 / 前向跟踪三张卡  </w:t>
+      </w:r>
+    </w:p>
+    <w:p>
+      <w:pPr>
         <w:spacing w:after="140" w:line="340"/>
       </w:pPr>
       <w:r>
@@ -5517,6 +5704,23 @@
     </w:p>
     <w:p>
       <w:pPr>
+        <w:spacing w:after="120" w:before="60"/>
+      </w:pPr>
+      <w:r>
+        <w:rPr>
+          <w:rFonts w:ascii="Microsoft YaHei" w:cs="Microsoft YaHei" w:eastAsia="Microsoft YaHei" w:hAnsi="Microsoft YaHei"/>
+          <w:b/>
+          <w:bCs/>
+          <w:color w:val="FFFFFF"/>
+          <w:sz w:val="19"/>
+          <w:szCs w:val="19"/>
+          <w:shd w:fill="13213A" w:color="auto" w:val="clear"/>
+        </w:rPr>
+        <w:t xml:space="preserve">  ▶ 幻灯片 13 / 14　深色页：五条底线 + 三个坑  </w:t>
+      </w:r>
+    </w:p>
+    <w:p>
+      <w:pPr>
         <w:pStyle w:val="ListParagraph"/>
         <w:numPr>
           <w:ilvl w:val="0"/>
@@ -5709,6 +5913,23 @@
     </w:p>
     <w:p>
       <w:pPr>
+        <w:spacing w:after="120" w:before="60"/>
+      </w:pPr>
+      <w:r>
+        <w:rPr>
+          <w:rFonts w:ascii="Microsoft YaHei" w:cs="Microsoft YaHei" w:eastAsia="Microsoft YaHei" w:hAnsi="Microsoft YaHei"/>
+          <w:b/>
+          <w:bCs/>
+          <w:color w:val="FFFFFF"/>
+          <w:sz w:val="19"/>
+          <w:szCs w:val="19"/>
+          <w:shd w:fill="13213A" w:color="auto" w:val="clear"/>
+        </w:rPr>
+        <w:t xml:space="preserve">  ▶ 幻灯片 14 / 14　三句话带走 + 作业  </w:t>
+      </w:r>
+    </w:p>
+    <w:p>
+      <w:pPr>
         <w:pStyle w:val="ListParagraph"/>
         <w:numPr>
           <w:ilvl w:val="0"/>
@@ -5827,7 +6048,7 @@
           <w:sz w:val="30"/>
           <w:szCs w:val="30"/>
         </w:rPr>
-        <w:t xml:space="preserve">附录 A　时间安排</w:t>
+        <w:t xml:space="preserve">附录 A　时间安排与幻灯片对照</w:t>
       </w:r>
     </w:p>
     <w:tbl>
@@ -5843,10 +6064,10 @@
         </w:tblBorders>
       </w:tblPr>
       <w:tblGrid>
-        <w:gridCol w:w="1400"/>
-        <w:gridCol w:w="3600"/>
-        <w:gridCol w:w="1200"/>
-        <w:gridCol w:w="3240"/>
+        <w:gridCol w:w="1500"/>
+        <w:gridCol w:w="3000"/>
+        <w:gridCol w:w="1000"/>
+        <w:gridCol w:w="3940"/>
       </w:tblGrid>
       <w:tr>
         <w:trPr>
@@ -5854,7 +6075,7 @@
         </w:trPr>
         <w:tc>
           <w:tcPr>
-            <w:tcW w:type="dxa" w:w="1400"/>
+            <w:tcW w:type="dxa" w:w="1500"/>
             <w:shd w:fill="13213A" w:color="auto" w:val="clear"/>
             <w:tcMar>
               <w:top w:type="dxa" w:w="70"/>
@@ -5882,7 +6103,7 @@
         </w:tc>
         <w:tc>
           <w:tcPr>
-            <w:tcW w:type="dxa" w:w="3600"/>
+            <w:tcW w:type="dxa" w:w="3000"/>
             <w:shd w:fill="13213A" w:color="auto" w:val="clear"/>
             <w:tcMar>
               <w:top w:type="dxa" w:w="70"/>
@@ -5904,13 +6125,13 @@
                 <w:sz w:val="19"/>
                 <w:szCs w:val="19"/>
               </w:rPr>
-              <w:t xml:space="preserve">内容</w:t>
-            </w:r>
-          </w:p>
-        </w:tc>
-        <w:tc>
-          <w:tcPr>
-            <w:tcW w:type="dxa" w:w="1200"/>
+              <w:t xml:space="preserve">讲义章节</w:t>
+            </w:r>
+          </w:p>
+        </w:tc>
+        <w:tc>
+          <w:tcPr>
+            <w:tcW w:type="dxa" w:w="1000"/>
             <w:shd w:fill="13213A" w:color="auto" w:val="clear"/>
             <w:tcMar>
               <w:top w:type="dxa" w:w="70"/>
@@ -5938,7 +6159,7 @@
         </w:tc>
         <w:tc>
           <w:tcPr>
-            <w:tcW w:type="dxa" w:w="3240"/>
+            <w:tcW w:type="dxa" w:w="3940"/>
             <w:shd w:fill="13213A" w:color="auto" w:val="clear"/>
             <w:tcMar>
               <w:top w:type="dxa" w:w="70"/>
@@ -5960,7 +6181,7 @@
                 <w:sz w:val="19"/>
                 <w:szCs w:val="19"/>
               </w:rPr>
-              <w:t xml:space="preserve">章节</w:t>
+              <w:t xml:space="preserve">页面内容</w:t>
             </w:r>
           </w:p>
         </w:tc>
@@ -5968,61 +6189,61 @@
       <w:tr>
         <w:tc>
           <w:tcPr>
-            <w:tcW w:type="dxa" w:w="1400"/>
-            <w:tcMar>
-              <w:top w:type="dxa" w:w="70"/>
-              <w:left w:type="dxa" w:w="110"/>
-              <w:bottom w:type="dxa" w:w="70"/>
-              <w:right w:type="dxa" w:w="110"/>
-            </w:tcMar>
-          </w:tcPr>
-          <w:p>
-            <w:pPr>
-              <w:spacing w:after="0" w:line="300"/>
-            </w:pPr>
-            <w:r>
-              <w:rPr>
-                <w:rFonts w:ascii="Microsoft YaHei" w:cs="Microsoft YaHei" w:eastAsia="Microsoft YaHei" w:hAnsi="Microsoft YaHei"/>
-                <w:b w:val="false"/>
-                <w:bCs w:val="false"/>
-                <w:color w:val="13213A"/>
-                <w:sz w:val="19"/>
-                <w:szCs w:val="19"/>
-              </w:rPr>
-              <w:t xml:space="preserve">0:00–1:00</w:t>
-            </w:r>
-          </w:p>
-        </w:tc>
-        <w:tc>
-          <w:tcPr>
-            <w:tcW w:type="dxa" w:w="3600"/>
-            <w:tcMar>
-              <w:top w:type="dxa" w:w="70"/>
-              <w:left w:type="dxa" w:w="110"/>
-              <w:bottom w:type="dxa" w:w="70"/>
-              <w:right w:type="dxa" w:w="110"/>
-            </w:tcMar>
-          </w:tcPr>
-          <w:p>
-            <w:pPr>
-              <w:spacing w:after="0" w:line="300"/>
-            </w:pPr>
-            <w:r>
-              <w:rPr>
-                <w:rFonts w:ascii="Microsoft YaHei" w:cs="Microsoft YaHei" w:eastAsia="Microsoft YaHei" w:hAnsi="Microsoft YaHei"/>
-                <w:b w:val="false"/>
-                <w:bCs w:val="false"/>
-                <w:color w:val="13213A"/>
-                <w:sz w:val="19"/>
-                <w:szCs w:val="19"/>
-              </w:rPr>
-              <w:t xml:space="preserve">三个问题</w:t>
-            </w:r>
-          </w:p>
-        </w:tc>
-        <w:tc>
-          <w:tcPr>
-            <w:tcW w:type="dxa" w:w="1200"/>
+            <w:tcW w:type="dxa" w:w="1500"/>
+            <w:tcMar>
+              <w:top w:type="dxa" w:w="70"/>
+              <w:left w:type="dxa" w:w="110"/>
+              <w:bottom w:type="dxa" w:w="70"/>
+              <w:right w:type="dxa" w:w="110"/>
+            </w:tcMar>
+          </w:tcPr>
+          <w:p>
+            <w:pPr>
+              <w:spacing w:after="0" w:line="300"/>
+            </w:pPr>
+            <w:r>
+              <w:rPr>
+                <w:rFonts w:ascii="Microsoft YaHei" w:cs="Microsoft YaHei" w:eastAsia="Microsoft YaHei" w:hAnsi="Microsoft YaHei"/>
+                <w:b w:val="false"/>
+                <w:bCs w:val="false"/>
+                <w:color w:val="13213A"/>
+                <w:sz w:val="19"/>
+                <w:szCs w:val="19"/>
+              </w:rPr>
+              <w:t xml:space="preserve">0:00–0:30</w:t>
+            </w:r>
+          </w:p>
+        </w:tc>
+        <w:tc>
+          <w:tcPr>
+            <w:tcW w:type="dxa" w:w="3000"/>
+            <w:tcMar>
+              <w:top w:type="dxa" w:w="70"/>
+              <w:left w:type="dxa" w:w="110"/>
+              <w:bottom w:type="dxa" w:w="70"/>
+              <w:right w:type="dxa" w:w="110"/>
+            </w:tcMar>
+          </w:tcPr>
+          <w:p>
+            <w:pPr>
+              <w:spacing w:after="0" w:line="300"/>
+            </w:pPr>
+            <w:r>
+              <w:rPr>
+                <w:rFonts w:ascii="Microsoft YaHei" w:cs="Microsoft YaHei" w:eastAsia="Microsoft YaHei" w:hAnsi="Microsoft YaHei"/>
+                <w:b w:val="false"/>
+                <w:bCs w:val="false"/>
+                <w:color w:val="13213A"/>
+                <w:sz w:val="19"/>
+                <w:szCs w:val="19"/>
+              </w:rPr>
+              <w:t xml:space="preserve">开讲之前</w:t>
+            </w:r>
+          </w:p>
+        </w:tc>
+        <w:tc>
+          <w:tcPr>
+            <w:tcW w:type="dxa" w:w="1000"/>
             <w:tcMar>
               <w:top w:type="dxa" w:w="70"/>
               <w:left w:type="dxa" w:w="110"/>
@@ -6049,28 +6270,28 @@
         </w:tc>
         <w:tc>
           <w:tcPr>
-            <w:tcW w:type="dxa" w:w="3240"/>
-            <w:tcMar>
-              <w:top w:type="dxa" w:w="70"/>
-              <w:left w:type="dxa" w:w="110"/>
-              <w:bottom w:type="dxa" w:w="70"/>
-              <w:right w:type="dxa" w:w="110"/>
-            </w:tcMar>
-          </w:tcPr>
-          <w:p>
-            <w:pPr>
-              <w:spacing w:after="0" w:line="300"/>
-            </w:pPr>
-            <w:r>
-              <w:rPr>
-                <w:rFonts w:ascii="Microsoft YaHei" w:cs="Microsoft YaHei" w:eastAsia="Microsoft YaHei" w:hAnsi="Microsoft YaHei"/>
-                <w:b w:val="false"/>
-                <w:bCs w:val="false"/>
-                <w:color w:val="13213A"/>
-                <w:sz w:val="19"/>
-                <w:szCs w:val="19"/>
-              </w:rPr>
-              <w:t xml:space="preserve">开讲之前</w:t>
+            <w:tcW w:type="dxa" w:w="3940"/>
+            <w:tcMar>
+              <w:top w:type="dxa" w:w="70"/>
+              <w:left w:type="dxa" w:w="110"/>
+              <w:bottom w:type="dxa" w:w="70"/>
+              <w:right w:type="dxa" w:w="110"/>
+            </w:tcMar>
+          </w:tcPr>
+          <w:p>
+            <w:pPr>
+              <w:spacing w:after="0" w:line="300"/>
+            </w:pPr>
+            <w:r>
+              <w:rPr>
+                <w:rFonts w:ascii="Microsoft YaHei" w:cs="Microsoft YaHei" w:eastAsia="Microsoft YaHei" w:hAnsi="Microsoft YaHei"/>
+                <w:b w:val="false"/>
+                <w:bCs w:val="false"/>
+                <w:color w:val="13213A"/>
+                <w:sz w:val="19"/>
+                <w:szCs w:val="19"/>
+              </w:rPr>
+              <w:t xml:space="preserve">封面</w:t>
             </w:r>
           </w:p>
         </w:tc>
@@ -6078,61 +6299,61 @@
       <w:tr>
         <w:tc>
           <w:tcPr>
-            <w:tcW w:type="dxa" w:w="1400"/>
-            <w:tcMar>
-              <w:top w:type="dxa" w:w="70"/>
-              <w:left w:type="dxa" w:w="110"/>
-              <w:bottom w:type="dxa" w:w="70"/>
-              <w:right w:type="dxa" w:w="110"/>
-            </w:tcMar>
-          </w:tcPr>
-          <w:p>
-            <w:pPr>
-              <w:spacing w:after="0" w:line="300"/>
-            </w:pPr>
-            <w:r>
-              <w:rPr>
-                <w:rFonts w:ascii="Microsoft YaHei" w:cs="Microsoft YaHei" w:eastAsia="Microsoft YaHei" w:hAnsi="Microsoft YaHei"/>
-                <w:b w:val="false"/>
-                <w:bCs w:val="false"/>
-                <w:color w:val="13213A"/>
-                <w:sz w:val="19"/>
-                <w:szCs w:val="19"/>
-              </w:rPr>
-              <w:t xml:space="preserve">1:00–3:00</w:t>
-            </w:r>
-          </w:p>
-        </w:tc>
-        <w:tc>
-          <w:tcPr>
-            <w:tcW w:type="dxa" w:w="3600"/>
-            <w:tcMar>
-              <w:top w:type="dxa" w:w="70"/>
-              <w:left w:type="dxa" w:w="110"/>
-              <w:bottom w:type="dxa" w:w="70"/>
-              <w:right w:type="dxa" w:w="110"/>
-            </w:tcMar>
-          </w:tcPr>
-          <w:p>
-            <w:pPr>
-              <w:spacing w:after="0" w:line="300"/>
-            </w:pPr>
-            <w:r>
-              <w:rPr>
-                <w:rFonts w:ascii="Microsoft YaHei" w:cs="Microsoft YaHei" w:eastAsia="Microsoft YaHei" w:hAnsi="Microsoft YaHei"/>
-                <w:b w:val="false"/>
-                <w:bCs w:val="false"/>
-                <w:color w:val="13213A"/>
-                <w:sz w:val="19"/>
-                <w:szCs w:val="19"/>
-              </w:rPr>
-              <w:t xml:space="preserve">因子与 IC</w:t>
-            </w:r>
-          </w:p>
-        </w:tc>
-        <w:tc>
-          <w:tcPr>
-            <w:tcW w:type="dxa" w:w="1200"/>
+            <w:tcW w:type="dxa" w:w="1500"/>
+            <w:tcMar>
+              <w:top w:type="dxa" w:w="70"/>
+              <w:left w:type="dxa" w:w="110"/>
+              <w:bottom w:type="dxa" w:w="70"/>
+              <w:right w:type="dxa" w:w="110"/>
+            </w:tcMar>
+          </w:tcPr>
+          <w:p>
+            <w:pPr>
+              <w:spacing w:after="0" w:line="300"/>
+            </w:pPr>
+            <w:r>
+              <w:rPr>
+                <w:rFonts w:ascii="Microsoft YaHei" w:cs="Microsoft YaHei" w:eastAsia="Microsoft YaHei" w:hAnsi="Microsoft YaHei"/>
+                <w:b w:val="false"/>
+                <w:bCs w:val="false"/>
+                <w:color w:val="13213A"/>
+                <w:sz w:val="19"/>
+                <w:szCs w:val="19"/>
+              </w:rPr>
+              <w:t xml:space="preserve">0:30–1:00</w:t>
+            </w:r>
+          </w:p>
+        </w:tc>
+        <w:tc>
+          <w:tcPr>
+            <w:tcW w:type="dxa" w:w="3000"/>
+            <w:tcMar>
+              <w:top w:type="dxa" w:w="70"/>
+              <w:left w:type="dxa" w:w="110"/>
+              <w:bottom w:type="dxa" w:w="70"/>
+              <w:right w:type="dxa" w:w="110"/>
+            </w:tcMar>
+          </w:tcPr>
+          <w:p>
+            <w:pPr>
+              <w:spacing w:after="0" w:line="300"/>
+            </w:pPr>
+            <w:r>
+              <w:rPr>
+                <w:rFonts w:ascii="Microsoft YaHei" w:cs="Microsoft YaHei" w:eastAsia="Microsoft YaHei" w:hAnsi="Microsoft YaHei"/>
+                <w:b w:val="false"/>
+                <w:bCs w:val="false"/>
+                <w:color w:val="13213A"/>
+                <w:sz w:val="19"/>
+                <w:szCs w:val="19"/>
+              </w:rPr>
+              <w:t xml:space="preserve">开讲之前</w:t>
+            </w:r>
+          </w:p>
+        </w:tc>
+        <w:tc>
+          <w:tcPr>
+            <w:tcW w:type="dxa" w:w="1000"/>
             <w:tcMar>
               <w:top w:type="dxa" w:w="70"/>
               <w:left w:type="dxa" w:w="110"/>
@@ -6159,28 +6380,28 @@
         </w:tc>
         <w:tc>
           <w:tcPr>
-            <w:tcW w:type="dxa" w:w="3240"/>
-            <w:tcMar>
-              <w:top w:type="dxa" w:w="70"/>
-              <w:left w:type="dxa" w:w="110"/>
-              <w:bottom w:type="dxa" w:w="70"/>
-              <w:right w:type="dxa" w:w="110"/>
-            </w:tcMar>
-          </w:tcPr>
-          <w:p>
-            <w:pPr>
-              <w:spacing w:after="0" w:line="300"/>
-            </w:pPr>
-            <w:r>
-              <w:rPr>
-                <w:rFonts w:ascii="Microsoft YaHei" w:cs="Microsoft YaHei" w:eastAsia="Microsoft YaHei" w:hAnsi="Microsoft YaHei"/>
-                <w:b w:val="false"/>
-                <w:bCs w:val="false"/>
-                <w:color w:val="13213A"/>
-                <w:sz w:val="19"/>
-                <w:szCs w:val="19"/>
-              </w:rPr>
-              <w:t xml:space="preserve">1</w:t>
+            <w:tcW w:type="dxa" w:w="3940"/>
+            <w:tcMar>
+              <w:top w:type="dxa" w:w="70"/>
+              <w:left w:type="dxa" w:w="110"/>
+              <w:bottom w:type="dxa" w:w="70"/>
+              <w:right w:type="dxa" w:w="110"/>
+            </w:tcMar>
+          </w:tcPr>
+          <w:p>
+            <w:pPr>
+              <w:spacing w:after="0" w:line="300"/>
+            </w:pPr>
+            <w:r>
+              <w:rPr>
+                <w:rFonts w:ascii="Microsoft YaHei" w:cs="Microsoft YaHei" w:eastAsia="Microsoft YaHei" w:hAnsi="Microsoft YaHei"/>
+                <w:b w:val="false"/>
+                <w:bCs w:val="false"/>
+                <w:color w:val="13213A"/>
+                <w:sz w:val="19"/>
+                <w:szCs w:val="19"/>
+              </w:rPr>
+              <w:t xml:space="preserve">三个问题</w:t>
             </w:r>
           </w:p>
         </w:tc>
@@ -6188,61 +6409,61 @@
       <w:tr>
         <w:tc>
           <w:tcPr>
-            <w:tcW w:type="dxa" w:w="1400"/>
-            <w:tcMar>
-              <w:top w:type="dxa" w:w="70"/>
-              <w:left w:type="dxa" w:w="110"/>
-              <w:bottom w:type="dxa" w:w="70"/>
-              <w:right w:type="dxa" w:w="110"/>
-            </w:tcMar>
-          </w:tcPr>
-          <w:p>
-            <w:pPr>
-              <w:spacing w:after="0" w:line="300"/>
-            </w:pPr>
-            <w:r>
-              <w:rPr>
-                <w:rFonts w:ascii="Microsoft YaHei" w:cs="Microsoft YaHei" w:eastAsia="Microsoft YaHei" w:hAnsi="Microsoft YaHei"/>
-                <w:b w:val="false"/>
-                <w:bCs w:val="false"/>
-                <w:color w:val="13213A"/>
-                <w:sz w:val="19"/>
-                <w:szCs w:val="19"/>
-              </w:rPr>
-              <w:t xml:space="preserve">3:00–4:00</w:t>
-            </w:r>
-          </w:p>
-        </w:tc>
-        <w:tc>
-          <w:tcPr>
-            <w:tcW w:type="dxa" w:w="3600"/>
-            <w:tcMar>
-              <w:top w:type="dxa" w:w="70"/>
-              <w:left w:type="dxa" w:w="110"/>
-              <w:bottom w:type="dxa" w:w="70"/>
-              <w:right w:type="dxa" w:w="110"/>
-            </w:tcMar>
-          </w:tcPr>
-          <w:p>
-            <w:pPr>
-              <w:spacing w:after="0" w:line="300"/>
-            </w:pPr>
-            <w:r>
-              <w:rPr>
-                <w:rFonts w:ascii="Microsoft YaHei" w:cs="Microsoft YaHei" w:eastAsia="Microsoft YaHei" w:hAnsi="Microsoft YaHei"/>
-                <w:b w:val="false"/>
-                <w:bCs w:val="false"/>
-                <w:color w:val="13213A"/>
-                <w:sz w:val="19"/>
-                <w:szCs w:val="19"/>
-              </w:rPr>
-              <w:t xml:space="preserve">积木</w:t>
-            </w:r>
-          </w:p>
-        </w:tc>
-        <w:tc>
-          <w:tcPr>
-            <w:tcW w:type="dxa" w:w="1200"/>
+            <w:tcW w:type="dxa" w:w="1500"/>
+            <w:tcMar>
+              <w:top w:type="dxa" w:w="70"/>
+              <w:left w:type="dxa" w:w="110"/>
+              <w:bottom w:type="dxa" w:w="70"/>
+              <w:right w:type="dxa" w:w="110"/>
+            </w:tcMar>
+          </w:tcPr>
+          <w:p>
+            <w:pPr>
+              <w:spacing w:after="0" w:line="300"/>
+            </w:pPr>
+            <w:r>
+              <w:rPr>
+                <w:rFonts w:ascii="Microsoft YaHei" w:cs="Microsoft YaHei" w:eastAsia="Microsoft YaHei" w:hAnsi="Microsoft YaHei"/>
+                <w:b w:val="false"/>
+                <w:bCs w:val="false"/>
+                <w:color w:val="13213A"/>
+                <w:sz w:val="19"/>
+                <w:szCs w:val="19"/>
+              </w:rPr>
+              <w:t xml:space="preserve">1:00–2:00</w:t>
+            </w:r>
+          </w:p>
+        </w:tc>
+        <w:tc>
+          <w:tcPr>
+            <w:tcW w:type="dxa" w:w="3000"/>
+            <w:tcMar>
+              <w:top w:type="dxa" w:w="70"/>
+              <w:left w:type="dxa" w:w="110"/>
+              <w:bottom w:type="dxa" w:w="70"/>
+              <w:right w:type="dxa" w:w="110"/>
+            </w:tcMar>
+          </w:tcPr>
+          <w:p>
+            <w:pPr>
+              <w:spacing w:after="0" w:line="300"/>
+            </w:pPr>
+            <w:r>
+              <w:rPr>
+                <w:rFonts w:ascii="Microsoft YaHei" w:cs="Microsoft YaHei" w:eastAsia="Microsoft YaHei" w:hAnsi="Microsoft YaHei"/>
+                <w:b w:val="false"/>
+                <w:bCs w:val="false"/>
+                <w:color w:val="13213A"/>
+                <w:sz w:val="19"/>
+                <w:szCs w:val="19"/>
+              </w:rPr>
+              <w:t xml:space="preserve">1.1 因子</w:t>
+            </w:r>
+          </w:p>
+        </w:tc>
+        <w:tc>
+          <w:tcPr>
+            <w:tcW w:type="dxa" w:w="1000"/>
             <w:tcMar>
               <w:top w:type="dxa" w:w="70"/>
               <w:left w:type="dxa" w:w="110"/>
@@ -6269,28 +6490,28 @@
         </w:tc>
         <w:tc>
           <w:tcPr>
-            <w:tcW w:type="dxa" w:w="3240"/>
-            <w:tcMar>
-              <w:top w:type="dxa" w:w="70"/>
-              <w:left w:type="dxa" w:w="110"/>
-              <w:bottom w:type="dxa" w:w="70"/>
-              <w:right w:type="dxa" w:w="110"/>
-            </w:tcMar>
-          </w:tcPr>
-          <w:p>
-            <w:pPr>
-              <w:spacing w:after="0" w:line="300"/>
-            </w:pPr>
-            <w:r>
-              <w:rPr>
-                <w:rFonts w:ascii="Microsoft YaHei" w:cs="Microsoft YaHei" w:eastAsia="Microsoft YaHei" w:hAnsi="Microsoft YaHei"/>
-                <w:b w:val="false"/>
-                <w:bCs w:val="false"/>
-                <w:color w:val="13213A"/>
-                <w:sz w:val="19"/>
-                <w:szCs w:val="19"/>
-              </w:rPr>
-              <w:t xml:space="preserve">2</w:t>
+            <w:tcW w:type="dxa" w:w="3940"/>
+            <w:tcMar>
+              <w:top w:type="dxa" w:w="70"/>
+              <w:left w:type="dxa" w:w="110"/>
+              <w:bottom w:type="dxa" w:w="70"/>
+              <w:right w:type="dxa" w:w="110"/>
+            </w:tcMar>
+          </w:tcPr>
+          <w:p>
+            <w:pPr>
+              <w:spacing w:after="0" w:line="300"/>
+            </w:pPr>
+            <w:r>
+              <w:rPr>
+                <w:rFonts w:ascii="Microsoft YaHei" w:cs="Microsoft YaHei" w:eastAsia="Microsoft YaHei" w:hAnsi="Microsoft YaHei"/>
+                <w:b w:val="false"/>
+                <w:bCs w:val="false"/>
+                <w:color w:val="13213A"/>
+                <w:sz w:val="19"/>
+                <w:szCs w:val="19"/>
+              </w:rPr>
+              <w:t xml:space="preserve">排名表 + 动量因子表达式</w:t>
             </w:r>
           </w:p>
         </w:tc>
@@ -6298,109 +6519,109 @@
       <w:tr>
         <w:tc>
           <w:tcPr>
-            <w:tcW w:type="dxa" w:w="1400"/>
-            <w:tcMar>
-              <w:top w:type="dxa" w:w="70"/>
-              <w:left w:type="dxa" w:w="110"/>
-              <w:bottom w:type="dxa" w:w="70"/>
-              <w:right w:type="dxa" w:w="110"/>
-            </w:tcMar>
-          </w:tcPr>
-          <w:p>
-            <w:pPr>
-              <w:spacing w:after="0" w:line="300"/>
-            </w:pPr>
-            <w:r>
-              <w:rPr>
-                <w:rFonts w:ascii="Microsoft YaHei" w:cs="Microsoft YaHei" w:eastAsia="Microsoft YaHei" w:hAnsi="Microsoft YaHei"/>
-                <w:b w:val="false"/>
-                <w:bCs w:val="false"/>
-                <w:color w:val="13213A"/>
-                <w:sz w:val="19"/>
-                <w:szCs w:val="19"/>
-              </w:rPr>
-              <w:t xml:space="preserve">4:00–6:00</w:t>
-            </w:r>
-          </w:p>
-        </w:tc>
-        <w:tc>
-          <w:tcPr>
-            <w:tcW w:type="dxa" w:w="3600"/>
-            <w:tcMar>
-              <w:top w:type="dxa" w:w="70"/>
-              <w:left w:type="dxa" w:w="110"/>
-              <w:bottom w:type="dxa" w:w="70"/>
-              <w:right w:type="dxa" w:w="110"/>
-            </w:tcMar>
-          </w:tcPr>
-          <w:p>
-            <w:pPr>
-              <w:spacing w:after="0" w:line="300"/>
-            </w:pPr>
-            <w:r>
-              <w:rPr>
-                <w:rFonts w:ascii="Microsoft YaHei" w:cs="Microsoft YaHei" w:eastAsia="Microsoft YaHei" w:hAnsi="Microsoft YaHei"/>
-                <w:b w:val="false"/>
-                <w:bCs w:val="false"/>
-                <w:color w:val="13213A"/>
-                <w:sz w:val="19"/>
-                <w:szCs w:val="19"/>
-              </w:rPr>
-              <w:t xml:space="preserve">样本内、留出集、录取线</w:t>
-            </w:r>
-          </w:p>
-        </w:tc>
-        <w:tc>
-          <w:tcPr>
-            <w:tcW w:type="dxa" w:w="1200"/>
-            <w:tcMar>
-              <w:top w:type="dxa" w:w="70"/>
-              <w:left w:type="dxa" w:w="110"/>
-              <w:bottom w:type="dxa" w:w="70"/>
-              <w:right w:type="dxa" w:w="110"/>
-            </w:tcMar>
-          </w:tcPr>
-          <w:p>
-            <w:pPr>
-              <w:spacing w:after="0" w:line="300"/>
-            </w:pPr>
-            <w:r>
-              <w:rPr>
-                <w:rFonts w:ascii="Microsoft YaHei" w:cs="Microsoft YaHei" w:eastAsia="Microsoft YaHei" w:hAnsi="Microsoft YaHei"/>
-                <w:b w:val="false"/>
-                <w:bCs w:val="false"/>
-                <w:color w:val="13213A"/>
-                <w:sz w:val="19"/>
-                <w:szCs w:val="19"/>
-              </w:rPr>
-              <w:t xml:space="preserve">4–5</w:t>
-            </w:r>
-          </w:p>
-        </w:tc>
-        <w:tc>
-          <w:tcPr>
-            <w:tcW w:type="dxa" w:w="3240"/>
-            <w:tcMar>
-              <w:top w:type="dxa" w:w="70"/>
-              <w:left w:type="dxa" w:w="110"/>
-              <w:bottom w:type="dxa" w:w="70"/>
-              <w:right w:type="dxa" w:w="110"/>
-            </w:tcMar>
-          </w:tcPr>
-          <w:p>
-            <w:pPr>
-              <w:spacing w:after="0" w:line="300"/>
-            </w:pPr>
-            <w:r>
-              <w:rPr>
-                <w:rFonts w:ascii="Microsoft YaHei" w:cs="Microsoft YaHei" w:eastAsia="Microsoft YaHei" w:hAnsi="Microsoft YaHei"/>
-                <w:b w:val="false"/>
-                <w:bCs w:val="false"/>
-                <w:color w:val="13213A"/>
-                <w:sz w:val="19"/>
-                <w:szCs w:val="19"/>
-              </w:rPr>
-              <w:t xml:space="preserve">3</w:t>
+            <w:tcW w:type="dxa" w:w="1500"/>
+            <w:tcMar>
+              <w:top w:type="dxa" w:w="70"/>
+              <w:left w:type="dxa" w:w="110"/>
+              <w:bottom w:type="dxa" w:w="70"/>
+              <w:right w:type="dxa" w:w="110"/>
+            </w:tcMar>
+          </w:tcPr>
+          <w:p>
+            <w:pPr>
+              <w:spacing w:after="0" w:line="300"/>
+            </w:pPr>
+            <w:r>
+              <w:rPr>
+                <w:rFonts w:ascii="Microsoft YaHei" w:cs="Microsoft YaHei" w:eastAsia="Microsoft YaHei" w:hAnsi="Microsoft YaHei"/>
+                <w:b w:val="false"/>
+                <w:bCs w:val="false"/>
+                <w:color w:val="13213A"/>
+                <w:sz w:val="19"/>
+                <w:szCs w:val="19"/>
+              </w:rPr>
+              <w:t xml:space="preserve">2:00–3:00</w:t>
+            </w:r>
+          </w:p>
+        </w:tc>
+        <w:tc>
+          <w:tcPr>
+            <w:tcW w:type="dxa" w:w="3000"/>
+            <w:tcMar>
+              <w:top w:type="dxa" w:w="70"/>
+              <w:left w:type="dxa" w:w="110"/>
+              <w:bottom w:type="dxa" w:w="70"/>
+              <w:right w:type="dxa" w:w="110"/>
+            </w:tcMar>
+          </w:tcPr>
+          <w:p>
+            <w:pPr>
+              <w:spacing w:after="0" w:line="300"/>
+            </w:pPr>
+            <w:r>
+              <w:rPr>
+                <w:rFonts w:ascii="Microsoft YaHei" w:cs="Microsoft YaHei" w:eastAsia="Microsoft YaHei" w:hAnsi="Microsoft YaHei"/>
+                <w:b w:val="false"/>
+                <w:bCs w:val="false"/>
+                <w:color w:val="13213A"/>
+                <w:sz w:val="19"/>
+                <w:szCs w:val="19"/>
+              </w:rPr>
+              <w:t xml:space="preserve">1.2 IC</w:t>
+            </w:r>
+          </w:p>
+        </w:tc>
+        <w:tc>
+          <w:tcPr>
+            <w:tcW w:type="dxa" w:w="1000"/>
+            <w:tcMar>
+              <w:top w:type="dxa" w:w="70"/>
+              <w:left w:type="dxa" w:w="110"/>
+              <w:bottom w:type="dxa" w:w="70"/>
+              <w:right w:type="dxa" w:w="110"/>
+            </w:tcMar>
+          </w:tcPr>
+          <w:p>
+            <w:pPr>
+              <w:spacing w:after="0" w:line="300"/>
+            </w:pPr>
+            <w:r>
+              <w:rPr>
+                <w:rFonts w:ascii="Microsoft YaHei" w:cs="Microsoft YaHei" w:eastAsia="Microsoft YaHei" w:hAnsi="Microsoft YaHei"/>
+                <w:b w:val="false"/>
+                <w:bCs w:val="false"/>
+                <w:color w:val="13213A"/>
+                <w:sz w:val="19"/>
+                <w:szCs w:val="19"/>
+              </w:rPr>
+              <w:t xml:space="preserve">4</w:t>
+            </w:r>
+          </w:p>
+        </w:tc>
+        <w:tc>
+          <w:tcPr>
+            <w:tcW w:type="dxa" w:w="3940"/>
+            <w:tcMar>
+              <w:top w:type="dxa" w:w="70"/>
+              <w:left w:type="dxa" w:w="110"/>
+              <w:bottom w:type="dxa" w:w="70"/>
+              <w:right w:type="dxa" w:w="110"/>
+            </w:tcMar>
+          </w:tcPr>
+          <w:p>
+            <w:pPr>
+              <w:spacing w:after="0" w:line="300"/>
+            </w:pPr>
+            <w:r>
+              <w:rPr>
+                <w:rFonts w:ascii="Microsoft YaHei" w:cs="Microsoft YaHei" w:eastAsia="Microsoft YaHei" w:hAnsi="Microsoft YaHei"/>
+                <w:b w:val="false"/>
+                <w:bCs w:val="false"/>
+                <w:color w:val="13213A"/>
+                <w:sz w:val="19"/>
+                <w:szCs w:val="19"/>
+              </w:rPr>
+              <w:t xml:space="preserve">每日 IC 曲线 + 平均值 / 抖动</w:t>
             </w:r>
           </w:p>
         </w:tc>
@@ -6408,109 +6629,109 @@
       <w:tr>
         <w:tc>
           <w:tcPr>
-            <w:tcW w:type="dxa" w:w="1400"/>
-            <w:tcMar>
-              <w:top w:type="dxa" w:w="70"/>
-              <w:left w:type="dxa" w:w="110"/>
-              <w:bottom w:type="dxa" w:w="70"/>
-              <w:right w:type="dxa" w:w="110"/>
-            </w:tcMar>
-          </w:tcPr>
-          <w:p>
-            <w:pPr>
-              <w:spacing w:after="0" w:line="300"/>
-            </w:pPr>
-            <w:r>
-              <w:rPr>
-                <w:rFonts w:ascii="Microsoft YaHei" w:cs="Microsoft YaHei" w:eastAsia="Microsoft YaHei" w:hAnsi="Microsoft YaHei"/>
-                <w:b w:val="false"/>
-                <w:bCs w:val="false"/>
-                <w:color w:val="13213A"/>
-                <w:sz w:val="19"/>
-                <w:szCs w:val="19"/>
-              </w:rPr>
-              <w:t xml:space="preserve">6:00–10:00</w:t>
-            </w:r>
-          </w:p>
-        </w:tc>
-        <w:tc>
-          <w:tcPr>
-            <w:tcW w:type="dxa" w:w="3600"/>
-            <w:tcMar>
-              <w:top w:type="dxa" w:w="70"/>
-              <w:left w:type="dxa" w:w="110"/>
-              <w:bottom w:type="dxa" w:w="70"/>
-              <w:right w:type="dxa" w:w="110"/>
-            </w:tcMar>
-          </w:tcPr>
-          <w:p>
-            <w:pPr>
-              <w:spacing w:after="0" w:line="300"/>
-            </w:pPr>
-            <w:r>
-              <w:rPr>
-                <w:rFonts w:ascii="Microsoft YaHei" w:cs="Microsoft YaHei" w:eastAsia="Microsoft YaHei" w:hAnsi="Microsoft YaHei"/>
-                <w:b w:val="false"/>
-                <w:bCs w:val="false"/>
-                <w:color w:val="13213A"/>
-                <w:sz w:val="19"/>
-                <w:szCs w:val="19"/>
-              </w:rPr>
-              <w:t xml:space="preserve">Loop Engineering</w:t>
-            </w:r>
-          </w:p>
-        </w:tc>
-        <w:tc>
-          <w:tcPr>
-            <w:tcW w:type="dxa" w:w="1200"/>
-            <w:tcMar>
-              <w:top w:type="dxa" w:w="70"/>
-              <w:left w:type="dxa" w:w="110"/>
-              <w:bottom w:type="dxa" w:w="70"/>
-              <w:right w:type="dxa" w:w="110"/>
-            </w:tcMar>
-          </w:tcPr>
-          <w:p>
-            <w:pPr>
-              <w:spacing w:after="0" w:line="300"/>
-            </w:pPr>
-            <w:r>
-              <w:rPr>
-                <w:rFonts w:ascii="Microsoft YaHei" w:cs="Microsoft YaHei" w:eastAsia="Microsoft YaHei" w:hAnsi="Microsoft YaHei"/>
-                <w:b w:val="false"/>
-                <w:bCs w:val="false"/>
-                <w:color w:val="13213A"/>
-                <w:sz w:val="19"/>
-                <w:szCs w:val="19"/>
-              </w:rPr>
-              <w:t xml:space="preserve">6</w:t>
-            </w:r>
-          </w:p>
-        </w:tc>
-        <w:tc>
-          <w:tcPr>
-            <w:tcW w:type="dxa" w:w="3240"/>
-            <w:tcMar>
-              <w:top w:type="dxa" w:w="70"/>
-              <w:left w:type="dxa" w:w="110"/>
-              <w:bottom w:type="dxa" w:w="70"/>
-              <w:right w:type="dxa" w:w="110"/>
-            </w:tcMar>
-          </w:tcPr>
-          <w:p>
-            <w:pPr>
-              <w:spacing w:after="0" w:line="300"/>
-            </w:pPr>
-            <w:r>
-              <w:rPr>
-                <w:rFonts w:ascii="Microsoft YaHei" w:cs="Microsoft YaHei" w:eastAsia="Microsoft YaHei" w:hAnsi="Microsoft YaHei"/>
-                <w:b w:val="false"/>
-                <w:bCs w:val="false"/>
-                <w:color w:val="13213A"/>
-                <w:sz w:val="19"/>
-                <w:szCs w:val="19"/>
-              </w:rPr>
-              <w:t xml:space="preserve">4</w:t>
+            <w:tcW w:type="dxa" w:w="1500"/>
+            <w:tcMar>
+              <w:top w:type="dxa" w:w="70"/>
+              <w:left w:type="dxa" w:w="110"/>
+              <w:bottom w:type="dxa" w:w="70"/>
+              <w:right w:type="dxa" w:w="110"/>
+            </w:tcMar>
+          </w:tcPr>
+          <w:p>
+            <w:pPr>
+              <w:spacing w:after="0" w:line="300"/>
+            </w:pPr>
+            <w:r>
+              <w:rPr>
+                <w:rFonts w:ascii="Microsoft YaHei" w:cs="Microsoft YaHei" w:eastAsia="Microsoft YaHei" w:hAnsi="Microsoft YaHei"/>
+                <w:b w:val="false"/>
+                <w:bCs w:val="false"/>
+                <w:color w:val="13213A"/>
+                <w:sz w:val="19"/>
+                <w:szCs w:val="19"/>
+              </w:rPr>
+              <w:t xml:space="preserve">3:00–4:00</w:t>
+            </w:r>
+          </w:p>
+        </w:tc>
+        <w:tc>
+          <w:tcPr>
+            <w:tcW w:type="dxa" w:w="3000"/>
+            <w:tcMar>
+              <w:top w:type="dxa" w:w="70"/>
+              <w:left w:type="dxa" w:w="110"/>
+              <w:bottom w:type="dxa" w:w="70"/>
+              <w:right w:type="dxa" w:w="110"/>
+            </w:tcMar>
+          </w:tcPr>
+          <w:p>
+            <w:pPr>
+              <w:spacing w:after="0" w:line="300"/>
+            </w:pPr>
+            <w:r>
+              <w:rPr>
+                <w:rFonts w:ascii="Microsoft YaHei" w:cs="Microsoft YaHei" w:eastAsia="Microsoft YaHei" w:hAnsi="Microsoft YaHei"/>
+                <w:b w:val="false"/>
+                <w:bCs w:val="false"/>
+                <w:color w:val="13213A"/>
+                <w:sz w:val="19"/>
+                <w:szCs w:val="19"/>
+              </w:rPr>
+              <w:t xml:space="preserve">2 积木</w:t>
+            </w:r>
+          </w:p>
+        </w:tc>
+        <w:tc>
+          <w:tcPr>
+            <w:tcW w:type="dxa" w:w="1000"/>
+            <w:tcMar>
+              <w:top w:type="dxa" w:w="70"/>
+              <w:left w:type="dxa" w:w="110"/>
+              <w:bottom w:type="dxa" w:w="70"/>
+              <w:right w:type="dxa" w:w="110"/>
+            </w:tcMar>
+          </w:tcPr>
+          <w:p>
+            <w:pPr>
+              <w:spacing w:after="0" w:line="300"/>
+            </w:pPr>
+            <w:r>
+              <w:rPr>
+                <w:rFonts w:ascii="Microsoft YaHei" w:cs="Microsoft YaHei" w:eastAsia="Microsoft YaHei" w:hAnsi="Microsoft YaHei"/>
+                <w:b w:val="false"/>
+                <w:bCs w:val="false"/>
+                <w:color w:val="13213A"/>
+                <w:sz w:val="19"/>
+                <w:szCs w:val="19"/>
+              </w:rPr>
+              <w:t xml:space="preserve">5</w:t>
+            </w:r>
+          </w:p>
+        </w:tc>
+        <w:tc>
+          <w:tcPr>
+            <w:tcW w:type="dxa" w:w="3940"/>
+            <w:tcMar>
+              <w:top w:type="dxa" w:w="70"/>
+              <w:left w:type="dxa" w:w="110"/>
+              <w:bottom w:type="dxa" w:w="70"/>
+              <w:right w:type="dxa" w:w="110"/>
+            </w:tcMar>
+          </w:tcPr>
+          <w:p>
+            <w:pPr>
+              <w:spacing w:after="0" w:line="300"/>
+            </w:pPr>
+            <w:r>
+              <w:rPr>
+                <w:rFonts w:ascii="Microsoft YaHei" w:cs="Microsoft YaHei" w:eastAsia="Microsoft YaHei" w:hAnsi="Microsoft YaHei"/>
+                <w:b w:val="false"/>
+                <w:bCs w:val="false"/>
+                <w:color w:val="13213A"/>
+                <w:sz w:val="19"/>
+                <w:szCs w:val="19"/>
+              </w:rPr>
+              <w:t xml:space="preserve">四类积木 + 例子</w:t>
             </w:r>
           </w:p>
         </w:tc>
@@ -6518,109 +6739,109 @@
       <w:tr>
         <w:tc>
           <w:tcPr>
-            <w:tcW w:type="dxa" w:w="1400"/>
-            <w:tcMar>
-              <w:top w:type="dxa" w:w="70"/>
-              <w:left w:type="dxa" w:w="110"/>
-              <w:bottom w:type="dxa" w:w="70"/>
-              <w:right w:type="dxa" w:w="110"/>
-            </w:tcMar>
-          </w:tcPr>
-          <w:p>
-            <w:pPr>
-              <w:spacing w:after="0" w:line="300"/>
-            </w:pPr>
-            <w:r>
-              <w:rPr>
-                <w:rFonts w:ascii="Microsoft YaHei" w:cs="Microsoft YaHei" w:eastAsia="Microsoft YaHei" w:hAnsi="Microsoft YaHei"/>
-                <w:b w:val="false"/>
-                <w:bCs w:val="false"/>
-                <w:color w:val="13213A"/>
-                <w:sz w:val="19"/>
-                <w:szCs w:val="19"/>
-              </w:rPr>
-              <w:t xml:space="preserve">10:00–12:00</w:t>
-            </w:r>
-          </w:p>
-        </w:tc>
-        <w:tc>
-          <w:tcPr>
-            <w:tcW w:type="dxa" w:w="3600"/>
-            <w:tcMar>
-              <w:top w:type="dxa" w:w="70"/>
-              <w:left w:type="dxa" w:w="110"/>
-              <w:bottom w:type="dxa" w:w="70"/>
-              <w:right w:type="dxa" w:w="110"/>
-            </w:tcMar>
-          </w:tcPr>
-          <w:p>
-            <w:pPr>
-              <w:spacing w:after="0" w:line="300"/>
-            </w:pPr>
-            <w:r>
-              <w:rPr>
-                <w:rFonts w:ascii="Microsoft YaHei" w:cs="Microsoft YaHei" w:eastAsia="Microsoft YaHei" w:hAnsi="Microsoft YaHei"/>
-                <w:b w:val="false"/>
-                <w:bCs w:val="false"/>
-                <w:color w:val="13213A"/>
-                <w:sz w:val="19"/>
-                <w:szCs w:val="19"/>
-              </w:rPr>
-              <w:t xml:space="preserve">进化搜索与比较</w:t>
-            </w:r>
-          </w:p>
-        </w:tc>
-        <w:tc>
-          <w:tcPr>
-            <w:tcW w:type="dxa" w:w="1200"/>
-            <w:tcMar>
-              <w:top w:type="dxa" w:w="70"/>
-              <w:left w:type="dxa" w:w="110"/>
-              <w:bottom w:type="dxa" w:w="70"/>
-              <w:right w:type="dxa" w:w="110"/>
-            </w:tcMar>
-          </w:tcPr>
-          <w:p>
-            <w:pPr>
-              <w:spacing w:after="0" w:line="300"/>
-            </w:pPr>
-            <w:r>
-              <w:rPr>
-                <w:rFonts w:ascii="Microsoft YaHei" w:cs="Microsoft YaHei" w:eastAsia="Microsoft YaHei" w:hAnsi="Microsoft YaHei"/>
-                <w:b w:val="false"/>
-                <w:bCs w:val="false"/>
-                <w:color w:val="13213A"/>
-                <w:sz w:val="19"/>
-                <w:szCs w:val="19"/>
-              </w:rPr>
-              <w:t xml:space="preserve">7–8</w:t>
-            </w:r>
-          </w:p>
-        </w:tc>
-        <w:tc>
-          <w:tcPr>
-            <w:tcW w:type="dxa" w:w="3240"/>
-            <w:tcMar>
-              <w:top w:type="dxa" w:w="70"/>
-              <w:left w:type="dxa" w:w="110"/>
-              <w:bottom w:type="dxa" w:w="70"/>
-              <w:right w:type="dxa" w:w="110"/>
-            </w:tcMar>
-          </w:tcPr>
-          <w:p>
-            <w:pPr>
-              <w:spacing w:after="0" w:line="300"/>
-            </w:pPr>
-            <w:r>
-              <w:rPr>
-                <w:rFonts w:ascii="Microsoft YaHei" w:cs="Microsoft YaHei" w:eastAsia="Microsoft YaHei" w:hAnsi="Microsoft YaHei"/>
-                <w:b w:val="false"/>
-                <w:bCs w:val="false"/>
-                <w:color w:val="13213A"/>
-                <w:sz w:val="19"/>
-                <w:szCs w:val="19"/>
-              </w:rPr>
-              <w:t xml:space="preserve">5</w:t>
+            <w:tcW w:type="dxa" w:w="1500"/>
+            <w:tcMar>
+              <w:top w:type="dxa" w:w="70"/>
+              <w:left w:type="dxa" w:w="110"/>
+              <w:bottom w:type="dxa" w:w="70"/>
+              <w:right w:type="dxa" w:w="110"/>
+            </w:tcMar>
+          </w:tcPr>
+          <w:p>
+            <w:pPr>
+              <w:spacing w:after="0" w:line="300"/>
+            </w:pPr>
+            <w:r>
+              <w:rPr>
+                <w:rFonts w:ascii="Microsoft YaHei" w:cs="Microsoft YaHei" w:eastAsia="Microsoft YaHei" w:hAnsi="Microsoft YaHei"/>
+                <w:b w:val="false"/>
+                <w:bCs w:val="false"/>
+                <w:color w:val="13213A"/>
+                <w:sz w:val="19"/>
+                <w:szCs w:val="19"/>
+              </w:rPr>
+              <w:t xml:space="preserve">4:00–6:00</w:t>
+            </w:r>
+          </w:p>
+        </w:tc>
+        <w:tc>
+          <w:tcPr>
+            <w:tcW w:type="dxa" w:w="3000"/>
+            <w:tcMar>
+              <w:top w:type="dxa" w:w="70"/>
+              <w:left w:type="dxa" w:w="110"/>
+              <w:bottom w:type="dxa" w:w="70"/>
+              <w:right w:type="dxa" w:w="110"/>
+            </w:tcMar>
+          </w:tcPr>
+          <w:p>
+            <w:pPr>
+              <w:spacing w:after="0" w:line="300"/>
+            </w:pPr>
+            <w:r>
+              <w:rPr>
+                <w:rFonts w:ascii="Microsoft YaHei" w:cs="Microsoft YaHei" w:eastAsia="Microsoft YaHei" w:hAnsi="Microsoft YaHei"/>
+                <w:b w:val="false"/>
+                <w:bCs w:val="false"/>
+                <w:color w:val="13213A"/>
+                <w:sz w:val="19"/>
+                <w:szCs w:val="19"/>
+              </w:rPr>
+              <w:t xml:space="preserve">3 判卷</w:t>
+            </w:r>
+          </w:p>
+        </w:tc>
+        <w:tc>
+          <w:tcPr>
+            <w:tcW w:type="dxa" w:w="1000"/>
+            <w:tcMar>
+              <w:top w:type="dxa" w:w="70"/>
+              <w:left w:type="dxa" w:w="110"/>
+              <w:bottom w:type="dxa" w:w="70"/>
+              <w:right w:type="dxa" w:w="110"/>
+            </w:tcMar>
+          </w:tcPr>
+          <w:p>
+            <w:pPr>
+              <w:spacing w:after="0" w:line="300"/>
+            </w:pPr>
+            <w:r>
+              <w:rPr>
+                <w:rFonts w:ascii="Microsoft YaHei" w:cs="Microsoft YaHei" w:eastAsia="Microsoft YaHei" w:hAnsi="Microsoft YaHei"/>
+                <w:b w:val="false"/>
+                <w:bCs w:val="false"/>
+                <w:color w:val="13213A"/>
+                <w:sz w:val="19"/>
+                <w:szCs w:val="19"/>
+              </w:rPr>
+              <w:t xml:space="preserve">6</w:t>
+            </w:r>
+          </w:p>
+        </w:tc>
+        <w:tc>
+          <w:tcPr>
+            <w:tcW w:type="dxa" w:w="3940"/>
+            <w:tcMar>
+              <w:top w:type="dxa" w:w="70"/>
+              <w:left w:type="dxa" w:w="110"/>
+              <w:bottom w:type="dxa" w:w="70"/>
+              <w:right w:type="dxa" w:w="110"/>
+            </w:tcMar>
+          </w:tcPr>
+          <w:p>
+            <w:pPr>
+              <w:spacing w:after="0" w:line="300"/>
+            </w:pPr>
+            <w:r>
+              <w:rPr>
+                <w:rFonts w:ascii="Microsoft YaHei" w:cs="Microsoft YaHei" w:eastAsia="Microsoft YaHei" w:hAnsi="Microsoft YaHei"/>
+                <w:b w:val="false"/>
+                <w:bCs w:val="false"/>
+                <w:color w:val="13213A"/>
+                <w:sz w:val="19"/>
+                <w:szCs w:val="19"/>
+              </w:rPr>
+              <w:t xml:space="preserve">80/20 时间条 + 柱状图 + 录取线表</w:t>
             </w:r>
           </w:p>
         </w:tc>
@@ -6628,109 +6849,109 @@
       <w:tr>
         <w:tc>
           <w:tcPr>
-            <w:tcW w:type="dxa" w:w="1400"/>
-            <w:tcMar>
-              <w:top w:type="dxa" w:w="70"/>
-              <w:left w:type="dxa" w:w="110"/>
-              <w:bottom w:type="dxa" w:w="70"/>
-              <w:right w:type="dxa" w:w="110"/>
-            </w:tcMar>
-          </w:tcPr>
-          <w:p>
-            <w:pPr>
-              <w:spacing w:after="0" w:line="300"/>
-            </w:pPr>
-            <w:r>
-              <w:rPr>
-                <w:rFonts w:ascii="Microsoft YaHei" w:cs="Microsoft YaHei" w:eastAsia="Microsoft YaHei" w:hAnsi="Microsoft YaHei"/>
-                <w:b w:val="false"/>
-                <w:bCs w:val="false"/>
-                <w:color w:val="13213A"/>
-                <w:sz w:val="19"/>
-                <w:szCs w:val="19"/>
-              </w:rPr>
-              <w:t xml:space="preserve">12:00–13:30</w:t>
-            </w:r>
-          </w:p>
-        </w:tc>
-        <w:tc>
-          <w:tcPr>
-            <w:tcW w:type="dxa" w:w="3600"/>
-            <w:tcMar>
-              <w:top w:type="dxa" w:w="70"/>
-              <w:left w:type="dxa" w:w="110"/>
-              <w:bottom w:type="dxa" w:w="70"/>
-              <w:right w:type="dxa" w:w="110"/>
-            </w:tcMar>
-          </w:tcPr>
-          <w:p>
-            <w:pPr>
-              <w:spacing w:after="0" w:line="300"/>
-            </w:pPr>
-            <w:r>
-              <w:rPr>
-                <w:rFonts w:ascii="Microsoft YaHei" w:cs="Microsoft YaHei" w:eastAsia="Microsoft YaHei" w:hAnsi="Microsoft YaHei"/>
-                <w:b w:val="false"/>
-                <w:bCs w:val="false"/>
-                <w:color w:val="13213A"/>
-                <w:sz w:val="19"/>
-                <w:szCs w:val="19"/>
-              </w:rPr>
-              <w:t xml:space="preserve">因子到组合</w:t>
-            </w:r>
-          </w:p>
-        </w:tc>
-        <w:tc>
-          <w:tcPr>
-            <w:tcW w:type="dxa" w:w="1200"/>
-            <w:tcMar>
-              <w:top w:type="dxa" w:w="70"/>
-              <w:left w:type="dxa" w:w="110"/>
-              <w:bottom w:type="dxa" w:w="70"/>
-              <w:right w:type="dxa" w:w="110"/>
-            </w:tcMar>
-          </w:tcPr>
-          <w:p>
-            <w:pPr>
-              <w:spacing w:after="0" w:line="300"/>
-            </w:pPr>
-            <w:r>
-              <w:rPr>
-                <w:rFonts w:ascii="Microsoft YaHei" w:cs="Microsoft YaHei" w:eastAsia="Microsoft YaHei" w:hAnsi="Microsoft YaHei"/>
-                <w:b w:val="false"/>
-                <w:bCs w:val="false"/>
-                <w:color w:val="13213A"/>
-                <w:sz w:val="19"/>
-                <w:szCs w:val="19"/>
-              </w:rPr>
-              <w:t xml:space="preserve">9</w:t>
-            </w:r>
-          </w:p>
-        </w:tc>
-        <w:tc>
-          <w:tcPr>
-            <w:tcW w:type="dxa" w:w="3240"/>
-            <w:tcMar>
-              <w:top w:type="dxa" w:w="70"/>
-              <w:left w:type="dxa" w:w="110"/>
-              <w:bottom w:type="dxa" w:w="70"/>
-              <w:right w:type="dxa" w:w="110"/>
-            </w:tcMar>
-          </w:tcPr>
-          <w:p>
-            <w:pPr>
-              <w:spacing w:after="0" w:line="300"/>
-            </w:pPr>
-            <w:r>
-              <w:rPr>
-                <w:rFonts w:ascii="Microsoft YaHei" w:cs="Microsoft YaHei" w:eastAsia="Microsoft YaHei" w:hAnsi="Microsoft YaHei"/>
-                <w:b w:val="false"/>
-                <w:bCs w:val="false"/>
-                <w:color w:val="13213A"/>
-                <w:sz w:val="19"/>
-                <w:szCs w:val="19"/>
-              </w:rPr>
-              <w:t xml:space="preserve">6</w:t>
+            <w:tcW w:type="dxa" w:w="1500"/>
+            <w:tcMar>
+              <w:top w:type="dxa" w:w="70"/>
+              <w:left w:type="dxa" w:w="110"/>
+              <w:bottom w:type="dxa" w:w="70"/>
+              <w:right w:type="dxa" w:w="110"/>
+            </w:tcMar>
+          </w:tcPr>
+          <w:p>
+            <w:pPr>
+              <w:spacing w:after="0" w:line="300"/>
+            </w:pPr>
+            <w:r>
+              <w:rPr>
+                <w:rFonts w:ascii="Microsoft YaHei" w:cs="Microsoft YaHei" w:eastAsia="Microsoft YaHei" w:hAnsi="Microsoft YaHei"/>
+                <w:b w:val="false"/>
+                <w:bCs w:val="false"/>
+                <w:color w:val="13213A"/>
+                <w:sz w:val="19"/>
+                <w:szCs w:val="19"/>
+              </w:rPr>
+              <w:t xml:space="preserve">6:00–7:30</w:t>
+            </w:r>
+          </w:p>
+        </w:tc>
+        <w:tc>
+          <w:tcPr>
+            <w:tcW w:type="dxa" w:w="3000"/>
+            <w:tcMar>
+              <w:top w:type="dxa" w:w="70"/>
+              <w:left w:type="dxa" w:w="110"/>
+              <w:bottom w:type="dxa" w:w="70"/>
+              <w:right w:type="dxa" w:w="110"/>
+            </w:tcMar>
+          </w:tcPr>
+          <w:p>
+            <w:pPr>
+              <w:spacing w:after="0" w:line="300"/>
+            </w:pPr>
+            <w:r>
+              <w:rPr>
+                <w:rFonts w:ascii="Microsoft YaHei" w:cs="Microsoft YaHei" w:eastAsia="Microsoft YaHei" w:hAnsi="Microsoft YaHei"/>
+                <w:b w:val="false"/>
+                <w:bCs w:val="false"/>
+                <w:color w:val="13213A"/>
+                <w:sz w:val="19"/>
+                <w:szCs w:val="19"/>
+              </w:rPr>
+              <w:t xml:space="preserve">4.1–4.3 Loop 定义与四步</w:t>
+            </w:r>
+          </w:p>
+        </w:tc>
+        <w:tc>
+          <w:tcPr>
+            <w:tcW w:type="dxa" w:w="1000"/>
+            <w:tcMar>
+              <w:top w:type="dxa" w:w="70"/>
+              <w:left w:type="dxa" w:w="110"/>
+              <w:bottom w:type="dxa" w:w="70"/>
+              <w:right w:type="dxa" w:w="110"/>
+            </w:tcMar>
+          </w:tcPr>
+          <w:p>
+            <w:pPr>
+              <w:spacing w:after="0" w:line="300"/>
+            </w:pPr>
+            <w:r>
+              <w:rPr>
+                <w:rFonts w:ascii="Microsoft YaHei" w:cs="Microsoft YaHei" w:eastAsia="Microsoft YaHei" w:hAnsi="Microsoft YaHei"/>
+                <w:b w:val="false"/>
+                <w:bCs w:val="false"/>
+                <w:color w:val="13213A"/>
+                <w:sz w:val="19"/>
+                <w:szCs w:val="19"/>
+              </w:rPr>
+              <w:t xml:space="preserve">7</w:t>
+            </w:r>
+          </w:p>
+        </w:tc>
+        <w:tc>
+          <w:tcPr>
+            <w:tcW w:type="dxa" w:w="3940"/>
+            <w:tcMar>
+              <w:top w:type="dxa" w:w="70"/>
+              <w:left w:type="dxa" w:w="110"/>
+              <w:bottom w:type="dxa" w:w="70"/>
+              <w:right w:type="dxa" w:w="110"/>
+            </w:tcMar>
+          </w:tcPr>
+          <w:p>
+            <w:pPr>
+              <w:spacing w:after="0" w:line="300"/>
+            </w:pPr>
+            <w:r>
+              <w:rPr>
+                <w:rFonts w:ascii="Microsoft YaHei" w:cs="Microsoft YaHei" w:eastAsia="Microsoft YaHei" w:hAnsi="Microsoft YaHei"/>
+                <w:b w:val="false"/>
+                <w:bCs w:val="false"/>
+                <w:color w:val="13213A"/>
+                <w:sz w:val="19"/>
+                <w:szCs w:val="19"/>
+              </w:rPr>
+              <w:t xml:space="preserve">循环图 + 两张卡</w:t>
             </w:r>
           </w:p>
         </w:tc>
@@ -6738,109 +6959,109 @@
       <w:tr>
         <w:tc>
           <w:tcPr>
-            <w:tcW w:type="dxa" w:w="1400"/>
-            <w:tcMar>
-              <w:top w:type="dxa" w:w="70"/>
-              <w:left w:type="dxa" w:w="110"/>
-              <w:bottom w:type="dxa" w:w="70"/>
-              <w:right w:type="dxa" w:w="110"/>
-            </w:tcMar>
-          </w:tcPr>
-          <w:p>
-            <w:pPr>
-              <w:spacing w:after="0" w:line="300"/>
-            </w:pPr>
-            <w:r>
-              <w:rPr>
-                <w:rFonts w:ascii="Microsoft YaHei" w:cs="Microsoft YaHei" w:eastAsia="Microsoft YaHei" w:hAnsi="Microsoft YaHei"/>
-                <w:b w:val="false"/>
-                <w:bCs w:val="false"/>
-                <w:color w:val="13213A"/>
-                <w:sz w:val="19"/>
-                <w:szCs w:val="19"/>
-              </w:rPr>
-              <w:t xml:space="preserve">13:30–14:30</w:t>
-            </w:r>
-          </w:p>
-        </w:tc>
-        <w:tc>
-          <w:tcPr>
-            <w:tcW w:type="dxa" w:w="3600"/>
-            <w:tcMar>
-              <w:top w:type="dxa" w:w="70"/>
-              <w:left w:type="dxa" w:w="110"/>
-              <w:bottom w:type="dxa" w:w="70"/>
-              <w:right w:type="dxa" w:w="110"/>
-            </w:tcMar>
-          </w:tcPr>
-          <w:p>
-            <w:pPr>
-              <w:spacing w:after="0" w:line="300"/>
-            </w:pPr>
-            <w:r>
-              <w:rPr>
-                <w:rFonts w:ascii="Microsoft YaHei" w:cs="Microsoft YaHei" w:eastAsia="Microsoft YaHei" w:hAnsi="Microsoft YaHei"/>
-                <w:b w:val="false"/>
-                <w:bCs w:val="false"/>
-                <w:color w:val="13213A"/>
-                <w:sz w:val="19"/>
-                <w:szCs w:val="19"/>
-              </w:rPr>
-              <w:t xml:space="preserve">上线之后与底线</w:t>
-            </w:r>
-          </w:p>
-        </w:tc>
-        <w:tc>
-          <w:tcPr>
-            <w:tcW w:type="dxa" w:w="1200"/>
-            <w:tcMar>
-              <w:top w:type="dxa" w:w="70"/>
-              <w:left w:type="dxa" w:w="110"/>
-              <w:bottom w:type="dxa" w:w="70"/>
-              <w:right w:type="dxa" w:w="110"/>
-            </w:tcMar>
-          </w:tcPr>
-          <w:p>
-            <w:pPr>
-              <w:spacing w:after="0" w:line="300"/>
-            </w:pPr>
-            <w:r>
-              <w:rPr>
-                <w:rFonts w:ascii="Microsoft YaHei" w:cs="Microsoft YaHei" w:eastAsia="Microsoft YaHei" w:hAnsi="Microsoft YaHei"/>
-                <w:b w:val="false"/>
-                <w:bCs w:val="false"/>
-                <w:color w:val="13213A"/>
-                <w:sz w:val="19"/>
-                <w:szCs w:val="19"/>
-              </w:rPr>
-              <w:t xml:space="preserve">10–11</w:t>
-            </w:r>
-          </w:p>
-        </w:tc>
-        <w:tc>
-          <w:tcPr>
-            <w:tcW w:type="dxa" w:w="3240"/>
-            <w:tcMar>
-              <w:top w:type="dxa" w:w="70"/>
-              <w:left w:type="dxa" w:w="110"/>
-              <w:bottom w:type="dxa" w:w="70"/>
-              <w:right w:type="dxa" w:w="110"/>
-            </w:tcMar>
-          </w:tcPr>
-          <w:p>
-            <w:pPr>
-              <w:spacing w:after="0" w:line="300"/>
-            </w:pPr>
-            <w:r>
-              <w:rPr>
-                <w:rFonts w:ascii="Microsoft YaHei" w:cs="Microsoft YaHei" w:eastAsia="Microsoft YaHei" w:hAnsi="Microsoft YaHei"/>
-                <w:b w:val="false"/>
-                <w:bCs w:val="false"/>
-                <w:color w:val="13213A"/>
-                <w:sz w:val="19"/>
-                <w:szCs w:val="19"/>
-              </w:rPr>
-              <w:t xml:space="preserve">7、8</w:t>
+            <w:tcW w:type="dxa" w:w="1500"/>
+            <w:tcMar>
+              <w:top w:type="dxa" w:w="70"/>
+              <w:left w:type="dxa" w:w="110"/>
+              <w:bottom w:type="dxa" w:w="70"/>
+              <w:right w:type="dxa" w:w="110"/>
+            </w:tcMar>
+          </w:tcPr>
+          <w:p>
+            <w:pPr>
+              <w:spacing w:after="0" w:line="300"/>
+            </w:pPr>
+            <w:r>
+              <w:rPr>
+                <w:rFonts w:ascii="Microsoft YaHei" w:cs="Microsoft YaHei" w:eastAsia="Microsoft YaHei" w:hAnsi="Microsoft YaHei"/>
+                <w:b w:val="false"/>
+                <w:bCs w:val="false"/>
+                <w:color w:val="13213A"/>
+                <w:sz w:val="19"/>
+                <w:szCs w:val="19"/>
+              </w:rPr>
+              <w:t xml:space="preserve">7:30–9:00</w:t>
+            </w:r>
+          </w:p>
+        </w:tc>
+        <w:tc>
+          <w:tcPr>
+            <w:tcW w:type="dxa" w:w="3000"/>
+            <w:tcMar>
+              <w:top w:type="dxa" w:w="70"/>
+              <w:left w:type="dxa" w:w="110"/>
+              <w:bottom w:type="dxa" w:w="70"/>
+              <w:right w:type="dxa" w:w="110"/>
+            </w:tcMar>
+          </w:tcPr>
+          <w:p>
+            <w:pPr>
+              <w:spacing w:after="0" w:line="300"/>
+            </w:pPr>
+            <w:r>
+              <w:rPr>
+                <w:rFonts w:ascii="Microsoft YaHei" w:cs="Microsoft YaHei" w:eastAsia="Microsoft YaHei" w:hAnsi="Microsoft YaHei"/>
+                <w:b w:val="false"/>
+                <w:bCs w:val="false"/>
+                <w:color w:val="13213A"/>
+                <w:sz w:val="19"/>
+                <w:szCs w:val="19"/>
+              </w:rPr>
+              <w:t xml:space="preserve">4.4 三轮</w:t>
+            </w:r>
+          </w:p>
+        </w:tc>
+        <w:tc>
+          <w:tcPr>
+            <w:tcW w:type="dxa" w:w="1000"/>
+            <w:tcMar>
+              <w:top w:type="dxa" w:w="70"/>
+              <w:left w:type="dxa" w:w="110"/>
+              <w:bottom w:type="dxa" w:w="70"/>
+              <w:right w:type="dxa" w:w="110"/>
+            </w:tcMar>
+          </w:tcPr>
+          <w:p>
+            <w:pPr>
+              <w:spacing w:after="0" w:line="300"/>
+            </w:pPr>
+            <w:r>
+              <w:rPr>
+                <w:rFonts w:ascii="Microsoft YaHei" w:cs="Microsoft YaHei" w:eastAsia="Microsoft YaHei" w:hAnsi="Microsoft YaHei"/>
+                <w:b w:val="false"/>
+                <w:bCs w:val="false"/>
+                <w:color w:val="13213A"/>
+                <w:sz w:val="19"/>
+                <w:szCs w:val="19"/>
+              </w:rPr>
+              <w:t xml:space="preserve">8</w:t>
+            </w:r>
+          </w:p>
+        </w:tc>
+        <w:tc>
+          <w:tcPr>
+            <w:tcW w:type="dxa" w:w="3940"/>
+            <w:tcMar>
+              <w:top w:type="dxa" w:w="70"/>
+              <w:left w:type="dxa" w:w="110"/>
+              <w:bottom w:type="dxa" w:w="70"/>
+              <w:right w:type="dxa" w:w="110"/>
+            </w:tcMar>
+          </w:tcPr>
+          <w:p>
+            <w:pPr>
+              <w:spacing w:after="0" w:line="300"/>
+            </w:pPr>
+            <w:r>
+              <w:rPr>
+                <w:rFonts w:ascii="Microsoft YaHei" w:cs="Microsoft YaHei" w:eastAsia="Microsoft YaHei" w:hAnsi="Microsoft YaHei"/>
+                <w:b w:val="false"/>
+                <w:bCs w:val="false"/>
+                <w:color w:val="13213A"/>
+                <w:sz w:val="19"/>
+                <w:szCs w:val="19"/>
+              </w:rPr>
+              <w:t xml:space="preserve">三轮示例表</w:t>
             </w:r>
           </w:p>
         </w:tc>
@@ -6848,61 +7069,391 @@
       <w:tr>
         <w:tc>
           <w:tcPr>
-            <w:tcW w:type="dxa" w:w="1400"/>
-            <w:tcMar>
-              <w:top w:type="dxa" w:w="70"/>
-              <w:left w:type="dxa" w:w="110"/>
-              <w:bottom w:type="dxa" w:w="70"/>
-              <w:right w:type="dxa" w:w="110"/>
-            </w:tcMar>
-          </w:tcPr>
-          <w:p>
-            <w:pPr>
-              <w:spacing w:after="0" w:line="300"/>
-            </w:pPr>
-            <w:r>
-              <w:rPr>
-                <w:rFonts w:ascii="Microsoft YaHei" w:cs="Microsoft YaHei" w:eastAsia="Microsoft YaHei" w:hAnsi="Microsoft YaHei"/>
-                <w:b w:val="false"/>
-                <w:bCs w:val="false"/>
-                <w:color w:val="13213A"/>
-                <w:sz w:val="19"/>
-                <w:szCs w:val="19"/>
-              </w:rPr>
-              <w:t xml:space="preserve">14:30–15:00</w:t>
-            </w:r>
-          </w:p>
-        </w:tc>
-        <w:tc>
-          <w:tcPr>
-            <w:tcW w:type="dxa" w:w="3600"/>
-            <w:tcMar>
-              <w:top w:type="dxa" w:w="70"/>
-              <w:left w:type="dxa" w:w="110"/>
-              <w:bottom w:type="dxa" w:w="70"/>
-              <w:right w:type="dxa" w:w="110"/>
-            </w:tcMar>
-          </w:tcPr>
-          <w:p>
-            <w:pPr>
-              <w:spacing w:after="0" w:line="300"/>
-            </w:pPr>
-            <w:r>
-              <w:rPr>
-                <w:rFonts w:ascii="Microsoft YaHei" w:cs="Microsoft YaHei" w:eastAsia="Microsoft YaHei" w:hAnsi="Microsoft YaHei"/>
-                <w:b w:val="false"/>
-                <w:bCs w:val="false"/>
-                <w:color w:val="13213A"/>
-                <w:sz w:val="19"/>
-                <w:szCs w:val="19"/>
-              </w:rPr>
-              <w:t xml:space="preserve">总结与作业</w:t>
-            </w:r>
-          </w:p>
-        </w:tc>
-        <w:tc>
-          <w:tcPr>
-            <w:tcW w:type="dxa" w:w="1200"/>
+            <w:tcW w:type="dxa" w:w="1500"/>
+            <w:tcMar>
+              <w:top w:type="dxa" w:w="70"/>
+              <w:left w:type="dxa" w:w="110"/>
+              <w:bottom w:type="dxa" w:w="70"/>
+              <w:right w:type="dxa" w:w="110"/>
+            </w:tcMar>
+          </w:tcPr>
+          <w:p>
+            <w:pPr>
+              <w:spacing w:after="0" w:line="300"/>
+            </w:pPr>
+            <w:r>
+              <w:rPr>
+                <w:rFonts w:ascii="Microsoft YaHei" w:cs="Microsoft YaHei" w:eastAsia="Microsoft YaHei" w:hAnsi="Microsoft YaHei"/>
+                <w:b w:val="false"/>
+                <w:bCs w:val="false"/>
+                <w:color w:val="13213A"/>
+                <w:sz w:val="19"/>
+                <w:szCs w:val="19"/>
+              </w:rPr>
+              <w:t xml:space="preserve">9:00–10:00</w:t>
+            </w:r>
+          </w:p>
+        </w:tc>
+        <w:tc>
+          <w:tcPr>
+            <w:tcW w:type="dxa" w:w="3000"/>
+            <w:tcMar>
+              <w:top w:type="dxa" w:w="70"/>
+              <w:left w:type="dxa" w:w="110"/>
+              <w:bottom w:type="dxa" w:w="70"/>
+              <w:right w:type="dxa" w:w="110"/>
+            </w:tcMar>
+          </w:tcPr>
+          <w:p>
+            <w:pPr>
+              <w:spacing w:after="0" w:line="300"/>
+            </w:pPr>
+            <w:r>
+              <w:rPr>
+                <w:rFonts w:ascii="Microsoft YaHei" w:cs="Microsoft YaHei" w:eastAsia="Microsoft YaHei" w:hAnsi="Microsoft YaHei"/>
+                <w:b w:val="false"/>
+                <w:bCs w:val="false"/>
+                <w:color w:val="13213A"/>
+                <w:sz w:val="19"/>
+                <w:szCs w:val="19"/>
+              </w:rPr>
+              <w:t xml:space="preserve">4.5–4.7 边界与失效</w:t>
+            </w:r>
+          </w:p>
+        </w:tc>
+        <w:tc>
+          <w:tcPr>
+            <w:tcW w:type="dxa" w:w="1000"/>
+            <w:tcMar>
+              <w:top w:type="dxa" w:w="70"/>
+              <w:left w:type="dxa" w:w="110"/>
+              <w:bottom w:type="dxa" w:w="70"/>
+              <w:right w:type="dxa" w:w="110"/>
+            </w:tcMar>
+          </w:tcPr>
+          <w:p>
+            <w:pPr>
+              <w:spacing w:after="0" w:line="300"/>
+            </w:pPr>
+            <w:r>
+              <w:rPr>
+                <w:rFonts w:ascii="Microsoft YaHei" w:cs="Microsoft YaHei" w:eastAsia="Microsoft YaHei" w:hAnsi="Microsoft YaHei"/>
+                <w:b w:val="false"/>
+                <w:bCs w:val="false"/>
+                <w:color w:val="13213A"/>
+                <w:sz w:val="19"/>
+                <w:szCs w:val="19"/>
+              </w:rPr>
+              <w:t xml:space="preserve">9</w:t>
+            </w:r>
+          </w:p>
+        </w:tc>
+        <w:tc>
+          <w:tcPr>
+            <w:tcW w:type="dxa" w:w="3940"/>
+            <w:tcMar>
+              <w:top w:type="dxa" w:w="70"/>
+              <w:left w:type="dxa" w:w="110"/>
+              <w:bottom w:type="dxa" w:w="70"/>
+              <w:right w:type="dxa" w:w="110"/>
+            </w:tcMar>
+          </w:tcPr>
+          <w:p>
+            <w:pPr>
+              <w:spacing w:after="0" w:line="300"/>
+            </w:pPr>
+            <w:r>
+              <w:rPr>
+                <w:rFonts w:ascii="Microsoft YaHei" w:cs="Microsoft YaHei" w:eastAsia="Microsoft YaHei" w:hAnsi="Microsoft YaHei"/>
+                <w:b w:val="false"/>
+                <w:bCs w:val="false"/>
+                <w:color w:val="13213A"/>
+                <w:sz w:val="19"/>
+                <w:szCs w:val="19"/>
+              </w:rPr>
+              <w:t xml:space="preserve">能进 / 不能进 + 失效模式</w:t>
+            </w:r>
+          </w:p>
+        </w:tc>
+      </w:tr>
+      <w:tr>
+        <w:tc>
+          <w:tcPr>
+            <w:tcW w:type="dxa" w:w="1500"/>
+            <w:tcMar>
+              <w:top w:type="dxa" w:w="70"/>
+              <w:left w:type="dxa" w:w="110"/>
+              <w:bottom w:type="dxa" w:w="70"/>
+              <w:right w:type="dxa" w:w="110"/>
+            </w:tcMar>
+          </w:tcPr>
+          <w:p>
+            <w:pPr>
+              <w:spacing w:after="0" w:line="300"/>
+            </w:pPr>
+            <w:r>
+              <w:rPr>
+                <w:rFonts w:ascii="Microsoft YaHei" w:cs="Microsoft YaHei" w:eastAsia="Microsoft YaHei" w:hAnsi="Microsoft YaHei"/>
+                <w:b w:val="false"/>
+                <w:bCs w:val="false"/>
+                <w:color w:val="13213A"/>
+                <w:sz w:val="19"/>
+                <w:szCs w:val="19"/>
+              </w:rPr>
+              <w:t xml:space="preserve">10:00–12:00</w:t>
+            </w:r>
+          </w:p>
+        </w:tc>
+        <w:tc>
+          <w:tcPr>
+            <w:tcW w:type="dxa" w:w="3000"/>
+            <w:tcMar>
+              <w:top w:type="dxa" w:w="70"/>
+              <w:left w:type="dxa" w:w="110"/>
+              <w:bottom w:type="dxa" w:w="70"/>
+              <w:right w:type="dxa" w:w="110"/>
+            </w:tcMar>
+          </w:tcPr>
+          <w:p>
+            <w:pPr>
+              <w:spacing w:after="0" w:line="300"/>
+            </w:pPr>
+            <w:r>
+              <w:rPr>
+                <w:rFonts w:ascii="Microsoft YaHei" w:cs="Microsoft YaHei" w:eastAsia="Microsoft YaHei" w:hAnsi="Microsoft YaHei"/>
+                <w:b w:val="false"/>
+                <w:bCs w:val="false"/>
+                <w:color w:val="13213A"/>
+                <w:sz w:val="19"/>
+                <w:szCs w:val="19"/>
+              </w:rPr>
+              <w:t xml:space="preserve">5 进化搜索</w:t>
+            </w:r>
+          </w:p>
+        </w:tc>
+        <w:tc>
+          <w:tcPr>
+            <w:tcW w:type="dxa" w:w="1000"/>
+            <w:tcMar>
+              <w:top w:type="dxa" w:w="70"/>
+              <w:left w:type="dxa" w:w="110"/>
+              <w:bottom w:type="dxa" w:w="70"/>
+              <w:right w:type="dxa" w:w="110"/>
+            </w:tcMar>
+          </w:tcPr>
+          <w:p>
+            <w:pPr>
+              <w:spacing w:after="0" w:line="300"/>
+            </w:pPr>
+            <w:r>
+              <w:rPr>
+                <w:rFonts w:ascii="Microsoft YaHei" w:cs="Microsoft YaHei" w:eastAsia="Microsoft YaHei" w:hAnsi="Microsoft YaHei"/>
+                <w:b w:val="false"/>
+                <w:bCs w:val="false"/>
+                <w:color w:val="13213A"/>
+                <w:sz w:val="19"/>
+                <w:szCs w:val="19"/>
+              </w:rPr>
+              <w:t xml:space="preserve">10</w:t>
+            </w:r>
+          </w:p>
+        </w:tc>
+        <w:tc>
+          <w:tcPr>
+            <w:tcW w:type="dxa" w:w="3940"/>
+            <w:tcMar>
+              <w:top w:type="dxa" w:w="70"/>
+              <w:left w:type="dxa" w:w="110"/>
+              <w:bottom w:type="dxa" w:w="70"/>
+              <w:right w:type="dxa" w:w="110"/>
+            </w:tcMar>
+          </w:tcPr>
+          <w:p>
+            <w:pPr>
+              <w:spacing w:after="0" w:line="300"/>
+            </w:pPr>
+            <w:r>
+              <w:rPr>
+                <w:rFonts w:ascii="Microsoft YaHei" w:cs="Microsoft YaHei" w:eastAsia="Microsoft YaHei" w:hAnsi="Microsoft YaHei"/>
+                <w:b w:val="false"/>
+                <w:bCs w:val="false"/>
+                <w:color w:val="13213A"/>
+                <w:sz w:val="19"/>
+                <w:szCs w:val="19"/>
+              </w:rPr>
+              <w:t xml:space="preserve">语法树 + 适应度 + 对比表</w:t>
+            </w:r>
+          </w:p>
+        </w:tc>
+      </w:tr>
+      <w:tr>
+        <w:tc>
+          <w:tcPr>
+            <w:tcW w:type="dxa" w:w="1500"/>
+            <w:tcMar>
+              <w:top w:type="dxa" w:w="70"/>
+              <w:left w:type="dxa" w:w="110"/>
+              <w:bottom w:type="dxa" w:w="70"/>
+              <w:right w:type="dxa" w:w="110"/>
+            </w:tcMar>
+          </w:tcPr>
+          <w:p>
+            <w:pPr>
+              <w:spacing w:after="0" w:line="300"/>
+            </w:pPr>
+            <w:r>
+              <w:rPr>
+                <w:rFonts w:ascii="Microsoft YaHei" w:cs="Microsoft YaHei" w:eastAsia="Microsoft YaHei" w:hAnsi="Microsoft YaHei"/>
+                <w:b w:val="false"/>
+                <w:bCs w:val="false"/>
+                <w:color w:val="13213A"/>
+                <w:sz w:val="19"/>
+                <w:szCs w:val="19"/>
+              </w:rPr>
+              <w:t xml:space="preserve">12:00–13:30</w:t>
+            </w:r>
+          </w:p>
+        </w:tc>
+        <w:tc>
+          <w:tcPr>
+            <w:tcW w:type="dxa" w:w="3000"/>
+            <w:tcMar>
+              <w:top w:type="dxa" w:w="70"/>
+              <w:left w:type="dxa" w:w="110"/>
+              <w:bottom w:type="dxa" w:w="70"/>
+              <w:right w:type="dxa" w:w="110"/>
+            </w:tcMar>
+          </w:tcPr>
+          <w:p>
+            <w:pPr>
+              <w:spacing w:after="0" w:line="300"/>
+            </w:pPr>
+            <w:r>
+              <w:rPr>
+                <w:rFonts w:ascii="Microsoft YaHei" w:cs="Microsoft YaHei" w:eastAsia="Microsoft YaHei" w:hAnsi="Microsoft YaHei"/>
+                <w:b w:val="false"/>
+                <w:bCs w:val="false"/>
+                <w:color w:val="13213A"/>
+                <w:sz w:val="19"/>
+                <w:szCs w:val="19"/>
+              </w:rPr>
+              <w:t xml:space="preserve">6 因子到组合</w:t>
+            </w:r>
+          </w:p>
+        </w:tc>
+        <w:tc>
+          <w:tcPr>
+            <w:tcW w:type="dxa" w:w="1000"/>
+            <w:tcMar>
+              <w:top w:type="dxa" w:w="70"/>
+              <w:left w:type="dxa" w:w="110"/>
+              <w:bottom w:type="dxa" w:w="70"/>
+              <w:right w:type="dxa" w:w="110"/>
+            </w:tcMar>
+          </w:tcPr>
+          <w:p>
+            <w:pPr>
+              <w:spacing w:after="0" w:line="300"/>
+            </w:pPr>
+            <w:r>
+              <w:rPr>
+                <w:rFonts w:ascii="Microsoft YaHei" w:cs="Microsoft YaHei" w:eastAsia="Microsoft YaHei" w:hAnsi="Microsoft YaHei"/>
+                <w:b w:val="false"/>
+                <w:bCs w:val="false"/>
+                <w:color w:val="13213A"/>
+                <w:sz w:val="19"/>
+                <w:szCs w:val="19"/>
+              </w:rPr>
+              <w:t xml:space="preserve">11</w:t>
+            </w:r>
+          </w:p>
+        </w:tc>
+        <w:tc>
+          <w:tcPr>
+            <w:tcW w:type="dxa" w:w="3940"/>
+            <w:tcMar>
+              <w:top w:type="dxa" w:w="70"/>
+              <w:left w:type="dxa" w:w="110"/>
+              <w:bottom w:type="dxa" w:w="70"/>
+              <w:right w:type="dxa" w:w="110"/>
+            </w:tcMar>
+          </w:tcPr>
+          <w:p>
+            <w:pPr>
+              <w:spacing w:after="0" w:line="300"/>
+            </w:pPr>
+            <w:r>
+              <w:rPr>
+                <w:rFonts w:ascii="Microsoft YaHei" w:cs="Microsoft YaHei" w:eastAsia="Microsoft YaHei" w:hAnsi="Microsoft YaHei"/>
+                <w:b w:val="false"/>
+                <w:bCs w:val="false"/>
+                <w:color w:val="13213A"/>
+                <w:sz w:val="19"/>
+                <w:szCs w:val="19"/>
+              </w:rPr>
+              <w:t xml:space="preserve">净值曲线 + 四个指标</w:t>
+            </w:r>
+          </w:p>
+        </w:tc>
+      </w:tr>
+      <w:tr>
+        <w:tc>
+          <w:tcPr>
+            <w:tcW w:type="dxa" w:w="1500"/>
+            <w:tcMar>
+              <w:top w:type="dxa" w:w="70"/>
+              <w:left w:type="dxa" w:w="110"/>
+              <w:bottom w:type="dxa" w:w="70"/>
+              <w:right w:type="dxa" w:w="110"/>
+            </w:tcMar>
+          </w:tcPr>
+          <w:p>
+            <w:pPr>
+              <w:spacing w:after="0" w:line="300"/>
+            </w:pPr>
+            <w:r>
+              <w:rPr>
+                <w:rFonts w:ascii="Microsoft YaHei" w:cs="Microsoft YaHei" w:eastAsia="Microsoft YaHei" w:hAnsi="Microsoft YaHei"/>
+                <w:b w:val="false"/>
+                <w:bCs w:val="false"/>
+                <w:color w:val="13213A"/>
+                <w:sz w:val="19"/>
+                <w:szCs w:val="19"/>
+              </w:rPr>
+              <w:t xml:space="preserve">13:30–14:15</w:t>
+            </w:r>
+          </w:p>
+        </w:tc>
+        <w:tc>
+          <w:tcPr>
+            <w:tcW w:type="dxa" w:w="3000"/>
+            <w:tcMar>
+              <w:top w:type="dxa" w:w="70"/>
+              <w:left w:type="dxa" w:w="110"/>
+              <w:bottom w:type="dxa" w:w="70"/>
+              <w:right w:type="dxa" w:w="110"/>
+            </w:tcMar>
+          </w:tcPr>
+          <w:p>
+            <w:pPr>
+              <w:spacing w:after="0" w:line="300"/>
+            </w:pPr>
+            <w:r>
+              <w:rPr>
+                <w:rFonts w:ascii="Microsoft YaHei" w:cs="Microsoft YaHei" w:eastAsia="Microsoft YaHei" w:hAnsi="Microsoft YaHei"/>
+                <w:b w:val="false"/>
+                <w:bCs w:val="false"/>
+                <w:color w:val="13213A"/>
+                <w:sz w:val="19"/>
+                <w:szCs w:val="19"/>
+              </w:rPr>
+              <w:t xml:space="preserve">7 上线之后</w:t>
+            </w:r>
+          </w:p>
+        </w:tc>
+        <w:tc>
+          <w:tcPr>
+            <w:tcW w:type="dxa" w:w="1000"/>
             <w:tcMar>
               <w:top w:type="dxa" w:w="70"/>
               <w:left w:type="dxa" w:w="110"/>
@@ -6929,28 +7480,248 @@
         </w:tc>
         <w:tc>
           <w:tcPr>
-            <w:tcW w:type="dxa" w:w="3240"/>
-            <w:tcMar>
-              <w:top w:type="dxa" w:w="70"/>
-              <w:left w:type="dxa" w:w="110"/>
-              <w:bottom w:type="dxa" w:w="70"/>
-              <w:right w:type="dxa" w:w="110"/>
-            </w:tcMar>
-          </w:tcPr>
-          <w:p>
-            <w:pPr>
-              <w:spacing w:after="0" w:line="300"/>
-            </w:pPr>
-            <w:r>
-              <w:rPr>
-                <w:rFonts w:ascii="Microsoft YaHei" w:cs="Microsoft YaHei" w:eastAsia="Microsoft YaHei" w:hAnsi="Microsoft YaHei"/>
-                <w:b w:val="false"/>
-                <w:bCs w:val="false"/>
-                <w:color w:val="13213A"/>
-                <w:sz w:val="19"/>
-                <w:szCs w:val="19"/>
-              </w:rPr>
-              <w:t xml:space="preserve">9</w:t>
+            <w:tcW w:type="dxa" w:w="3940"/>
+            <w:tcMar>
+              <w:top w:type="dxa" w:w="70"/>
+              <w:left w:type="dxa" w:w="110"/>
+              <w:bottom w:type="dxa" w:w="70"/>
+              <w:right w:type="dxa" w:w="110"/>
+            </w:tcMar>
+          </w:tcPr>
+          <w:p>
+            <w:pPr>
+              <w:spacing w:after="0" w:line="300"/>
+            </w:pPr>
+            <w:r>
+              <w:rPr>
+                <w:rFonts w:ascii="Microsoft YaHei" w:cs="Microsoft YaHei" w:eastAsia="Microsoft YaHei" w:hAnsi="Microsoft YaHei"/>
+                <w:b w:val="false"/>
+                <w:bCs w:val="false"/>
+                <w:color w:val="13213A"/>
+                <w:sz w:val="19"/>
+                <w:szCs w:val="19"/>
+              </w:rPr>
+              <w:t xml:space="preserve">IC 衰减曲线 + 三张卡</w:t>
+            </w:r>
+          </w:p>
+        </w:tc>
+      </w:tr>
+      <w:tr>
+        <w:tc>
+          <w:tcPr>
+            <w:tcW w:type="dxa" w:w="1500"/>
+            <w:tcMar>
+              <w:top w:type="dxa" w:w="70"/>
+              <w:left w:type="dxa" w:w="110"/>
+              <w:bottom w:type="dxa" w:w="70"/>
+              <w:right w:type="dxa" w:w="110"/>
+            </w:tcMar>
+          </w:tcPr>
+          <w:p>
+            <w:pPr>
+              <w:spacing w:after="0" w:line="300"/>
+            </w:pPr>
+            <w:r>
+              <w:rPr>
+                <w:rFonts w:ascii="Microsoft YaHei" w:cs="Microsoft YaHei" w:eastAsia="Microsoft YaHei" w:hAnsi="Microsoft YaHei"/>
+                <w:b w:val="false"/>
+                <w:bCs w:val="false"/>
+                <w:color w:val="13213A"/>
+                <w:sz w:val="19"/>
+                <w:szCs w:val="19"/>
+              </w:rPr>
+              <w:t xml:space="preserve">14:15–14:45</w:t>
+            </w:r>
+          </w:p>
+        </w:tc>
+        <w:tc>
+          <w:tcPr>
+            <w:tcW w:type="dxa" w:w="3000"/>
+            <w:tcMar>
+              <w:top w:type="dxa" w:w="70"/>
+              <w:left w:type="dxa" w:w="110"/>
+              <w:bottom w:type="dxa" w:w="70"/>
+              <w:right w:type="dxa" w:w="110"/>
+            </w:tcMar>
+          </w:tcPr>
+          <w:p>
+            <w:pPr>
+              <w:spacing w:after="0" w:line="300"/>
+            </w:pPr>
+            <w:r>
+              <w:rPr>
+                <w:rFonts w:ascii="Microsoft YaHei" w:cs="Microsoft YaHei" w:eastAsia="Microsoft YaHei" w:hAnsi="Microsoft YaHei"/>
+                <w:b w:val="false"/>
+                <w:bCs w:val="false"/>
+                <w:color w:val="13213A"/>
+                <w:sz w:val="19"/>
+                <w:szCs w:val="19"/>
+              </w:rPr>
+              <w:t xml:space="preserve">8 底线</w:t>
+            </w:r>
+          </w:p>
+        </w:tc>
+        <w:tc>
+          <w:tcPr>
+            <w:tcW w:type="dxa" w:w="1000"/>
+            <w:tcMar>
+              <w:top w:type="dxa" w:w="70"/>
+              <w:left w:type="dxa" w:w="110"/>
+              <w:bottom w:type="dxa" w:w="70"/>
+              <w:right w:type="dxa" w:w="110"/>
+            </w:tcMar>
+          </w:tcPr>
+          <w:p>
+            <w:pPr>
+              <w:spacing w:after="0" w:line="300"/>
+            </w:pPr>
+            <w:r>
+              <w:rPr>
+                <w:rFonts w:ascii="Microsoft YaHei" w:cs="Microsoft YaHei" w:eastAsia="Microsoft YaHei" w:hAnsi="Microsoft YaHei"/>
+                <w:b w:val="false"/>
+                <w:bCs w:val="false"/>
+                <w:color w:val="13213A"/>
+                <w:sz w:val="19"/>
+                <w:szCs w:val="19"/>
+              </w:rPr>
+              <w:t xml:space="preserve">13</w:t>
+            </w:r>
+          </w:p>
+        </w:tc>
+        <w:tc>
+          <w:tcPr>
+            <w:tcW w:type="dxa" w:w="3940"/>
+            <w:tcMar>
+              <w:top w:type="dxa" w:w="70"/>
+              <w:left w:type="dxa" w:w="110"/>
+              <w:bottom w:type="dxa" w:w="70"/>
+              <w:right w:type="dxa" w:w="110"/>
+            </w:tcMar>
+          </w:tcPr>
+          <w:p>
+            <w:pPr>
+              <w:spacing w:after="0" w:line="300"/>
+            </w:pPr>
+            <w:r>
+              <w:rPr>
+                <w:rFonts w:ascii="Microsoft YaHei" w:cs="Microsoft YaHei" w:eastAsia="Microsoft YaHei" w:hAnsi="Microsoft YaHei"/>
+                <w:b w:val="false"/>
+                <w:bCs w:val="false"/>
+                <w:color w:val="13213A"/>
+                <w:sz w:val="19"/>
+                <w:szCs w:val="19"/>
+              </w:rPr>
+              <w:t xml:space="preserve">五条底线 + 三个坑</w:t>
+            </w:r>
+          </w:p>
+        </w:tc>
+      </w:tr>
+      <w:tr>
+        <w:tc>
+          <w:tcPr>
+            <w:tcW w:type="dxa" w:w="1500"/>
+            <w:tcMar>
+              <w:top w:type="dxa" w:w="70"/>
+              <w:left w:type="dxa" w:w="110"/>
+              <w:bottom w:type="dxa" w:w="70"/>
+              <w:right w:type="dxa" w:w="110"/>
+            </w:tcMar>
+          </w:tcPr>
+          <w:p>
+            <w:pPr>
+              <w:spacing w:after="0" w:line="300"/>
+            </w:pPr>
+            <w:r>
+              <w:rPr>
+                <w:rFonts w:ascii="Microsoft YaHei" w:cs="Microsoft YaHei" w:eastAsia="Microsoft YaHei" w:hAnsi="Microsoft YaHei"/>
+                <w:b w:val="false"/>
+                <w:bCs w:val="false"/>
+                <w:color w:val="13213A"/>
+                <w:sz w:val="19"/>
+                <w:szCs w:val="19"/>
+              </w:rPr>
+              <w:t xml:space="preserve">14:45–15:00</w:t>
+            </w:r>
+          </w:p>
+        </w:tc>
+        <w:tc>
+          <w:tcPr>
+            <w:tcW w:type="dxa" w:w="3000"/>
+            <w:tcMar>
+              <w:top w:type="dxa" w:w="70"/>
+              <w:left w:type="dxa" w:w="110"/>
+              <w:bottom w:type="dxa" w:w="70"/>
+              <w:right w:type="dxa" w:w="110"/>
+            </w:tcMar>
+          </w:tcPr>
+          <w:p>
+            <w:pPr>
+              <w:spacing w:after="0" w:line="300"/>
+            </w:pPr>
+            <w:r>
+              <w:rPr>
+                <w:rFonts w:ascii="Microsoft YaHei" w:cs="Microsoft YaHei" w:eastAsia="Microsoft YaHei" w:hAnsi="Microsoft YaHei"/>
+                <w:b w:val="false"/>
+                <w:bCs w:val="false"/>
+                <w:color w:val="13213A"/>
+                <w:sz w:val="19"/>
+                <w:szCs w:val="19"/>
+              </w:rPr>
+              <w:t xml:space="preserve">9 总结</w:t>
+            </w:r>
+          </w:p>
+        </w:tc>
+        <w:tc>
+          <w:tcPr>
+            <w:tcW w:type="dxa" w:w="1000"/>
+            <w:tcMar>
+              <w:top w:type="dxa" w:w="70"/>
+              <w:left w:type="dxa" w:w="110"/>
+              <w:bottom w:type="dxa" w:w="70"/>
+              <w:right w:type="dxa" w:w="110"/>
+            </w:tcMar>
+          </w:tcPr>
+          <w:p>
+            <w:pPr>
+              <w:spacing w:after="0" w:line="300"/>
+            </w:pPr>
+            <w:r>
+              <w:rPr>
+                <w:rFonts w:ascii="Microsoft YaHei" w:cs="Microsoft YaHei" w:eastAsia="Microsoft YaHei" w:hAnsi="Microsoft YaHei"/>
+                <w:b w:val="false"/>
+                <w:bCs w:val="false"/>
+                <w:color w:val="13213A"/>
+                <w:sz w:val="19"/>
+                <w:szCs w:val="19"/>
+              </w:rPr>
+              <w:t xml:space="preserve">14</w:t>
+            </w:r>
+          </w:p>
+        </w:tc>
+        <w:tc>
+          <w:tcPr>
+            <w:tcW w:type="dxa" w:w="3940"/>
+            <w:tcMar>
+              <w:top w:type="dxa" w:w="70"/>
+              <w:left w:type="dxa" w:w="110"/>
+              <w:bottom w:type="dxa" w:w="70"/>
+              <w:right w:type="dxa" w:w="110"/>
+            </w:tcMar>
+          </w:tcPr>
+          <w:p>
+            <w:pPr>
+              <w:spacing w:after="0" w:line="300"/>
+            </w:pPr>
+            <w:r>
+              <w:rPr>
+                <w:rFonts w:ascii="Microsoft YaHei" w:cs="Microsoft YaHei" w:eastAsia="Microsoft YaHei" w:hAnsi="Microsoft YaHei"/>
+                <w:b w:val="false"/>
+                <w:bCs w:val="false"/>
+                <w:color w:val="13213A"/>
+                <w:sz w:val="19"/>
+                <w:szCs w:val="19"/>
+              </w:rPr>
+              <w:t xml:space="preserve">三句话 + 作业</w:t>
             </w:r>
           </w:p>
         </w:tc>

</xml_diff>

<commit_message>
Docs: deck with real website screenshots (terminal, mining, evolution lab, backtest, report card, paper trading); handout markers updated
Co-Authored-By: Claude Fable 5.1 <noreply@anthropic.com>
</commit_message>
<xml_diff>
--- a/docs/lecture/因子挖掘-15分钟讲义.docx
+++ b/docs/lecture/因子挖掘-15分钟讲义.docx
@@ -1653,7 +1653,7 @@
           <w:szCs w:val="19"/>
           <w:shd w:fill="13213A" w:color="auto" w:val="clear"/>
         </w:rPr>
-        <w:t xml:space="preserve">  ▶ 幻灯片 7 / 14　四步循环图（生成→评估→反思→更新）—— 4.1 至 4.3 共用此页  </w:t>
+        <w:t xml:space="preserve">  ▶ 幻灯片 7 / 14　四步循环图 + 网站因子挖掘板块截图 —— 4.1 至 4.3 共用此页  </w:t>
       </w:r>
     </w:p>
     <w:p>
@@ -4348,7 +4348,7 @@
           <w:szCs w:val="19"/>
           <w:shd w:fill="13213A" w:color="auto" w:val="clear"/>
         </w:rPr>
-        <w:t xml:space="preserve">  ▶ 幻灯片 10 / 14　语法树图 + 适应度三条修正 + 两种范式对比表  </w:t>
+        <w:t xml:space="preserve">  ▶ 幻灯片 10 / 14　语法树图 + 进化实验室截图 + 适应度三条修正（两种范式对比见讲义表格）  </w:t>
       </w:r>
     </w:p>
     <w:p>
@@ -4990,7 +4990,7 @@
           <w:szCs w:val="19"/>
           <w:shd w:fill="13213A" w:color="auto" w:val="clear"/>
         </w:rPr>
-        <w:t xml:space="preserve">  ▶ 幻灯片 11 / 14　组合 vs 基准净值曲线（示意）+ 四个指标  </w:t>
+        <w:t xml:space="preserve">  ▶ 幻灯片 11 / 14　真实组合回测截图（+69% vs 基准 +90%）+ 四个指标  </w:t>
       </w:r>
     </w:p>
     <w:p>
@@ -5520,7 +5520,7 @@
           <w:szCs w:val="19"/>
           <w:shd w:fill="13213A" w:color="auto" w:val="clear"/>
         </w:rPr>
-        <w:t xml:space="preserve">  ▶ 幻灯片 12 / 14　IC 随持有期曲线 + 衰减 / 移植 / 前向跟踪三张卡  </w:t>
+        <w:t xml:space="preserve">  ▶ 幻灯片 12 / 14　体检报告截图 + 模拟持仓截图 + 衰减 / 移植 / 前向三张卡  </w:t>
       </w:r>
     </w:p>
     <w:p>
@@ -6951,7 +6951,7 @@
                 <w:sz w:val="19"/>
                 <w:szCs w:val="19"/>
               </w:rPr>
-              <w:t xml:space="preserve">循环图 + 两张卡</w:t>
+              <w:t xml:space="preserve">循环图 + 网站截图</w:t>
             </w:r>
           </w:p>
         </w:tc>
@@ -7281,7 +7281,7 @@
                 <w:sz w:val="19"/>
                 <w:szCs w:val="19"/>
               </w:rPr>
-              <w:t xml:space="preserve">语法树 + 适应度 + 对比表</w:t>
+              <w:t xml:space="preserve">语法树 + 进化实验室截图</w:t>
             </w:r>
           </w:p>
         </w:tc>
@@ -7391,7 +7391,7 @@
                 <w:sz w:val="19"/>
                 <w:szCs w:val="19"/>
               </w:rPr>
-              <w:t xml:space="preserve">净值曲线 + 四个指标</w:t>
+              <w:t xml:space="preserve">真实回测截图 + 四个指标</w:t>
             </w:r>
           </w:p>
         </w:tc>
@@ -7501,7 +7501,7 @@
                 <w:sz w:val="19"/>
                 <w:szCs w:val="19"/>
               </w:rPr>
-              <w:t xml:space="preserve">IC 衰减曲线 + 三张卡</w:t>
+              <w:t xml:space="preserve">体检 + 模拟持仓截图 + 三张卡</w:t>
             </w:r>
           </w:p>
         </w:tc>

</xml_diff>